<commit_message>
Exploratory data analysis with vector search and more additional patient case data added
</commit_message>
<xml_diff>
--- a/plan type/RapportProjet_Bigdata_VECTOR_DB_21_10_2025.docx
+++ b/plan type/RapportProjet_Bigdata_VECTOR_DB_21_10_2025.docx
@@ -8190,23 +8190,7 @@
                 <w:bCs/>
                 <w:noProof/>
               </w:rPr>
-              <w:t>Bibliogra</w:t>
-            </w:r>
-            <w:r>
-              <w:rPr>
-                <w:rStyle w:val="Lienhypertexte"/>
-                <w:bCs/>
-                <w:noProof/>
-              </w:rPr>
-              <w:t>p</w:t>
-            </w:r>
-            <w:r>
-              <w:rPr>
-                <w:rStyle w:val="Lienhypertexte"/>
-                <w:bCs/>
-                <w:noProof/>
-              </w:rPr>
-              <w:t>hie</w:t>
+              <w:t>Bibliographie</w:t>
             </w:r>
             <w:r>
               <w:rPr>
@@ -10932,6 +10916,9 @@
     <w:p/>
     <w:p>
       <w:r>
+        <w:rPr>
+          <w:noProof/>
+        </w:rPr>
         <w:drawing>
           <wp:inline distT="0" distB="0" distL="0" distR="0" wp14:anchorId="24A25782" wp14:editId="0B1AE19D">
             <wp:extent cx="6645910" cy="3137535"/>
@@ -10988,17 +10975,7 @@
           <w:szCs w:val="24"/>
           <w:lang w:val="en-CA"/>
         </w:rPr>
-        <w:t xml:space="preserve">Figure: </w:t>
-      </w:r>
-      <w:r>
-        <w:rPr>
-          <w:b/>
-          <w:bCs/>
-          <w:sz w:val="24"/>
-          <w:szCs w:val="24"/>
-          <w:lang w:val="en-CA"/>
-        </w:rPr>
-        <w:t>Complete workflow of a vector search operation</w:t>
+        <w:t>Figure: Complete workflow of a vector search operation</w:t>
       </w:r>
     </w:p>
     <w:p>
@@ -17555,8 +17532,95 @@
           <w:sz w:val="24"/>
           <w:szCs w:val="24"/>
         </w:rPr>
-        <w:t>6</w:t>
-      </w:r>
+        <w:t>6.1 Contexte et enjeux</w:t>
+      </w:r>
+      <w:bookmarkEnd w:id="72"/>
+      <w:bookmarkEnd w:id="73"/>
+    </w:p>
+    <w:p>
+      <w:pPr>
+        <w:pStyle w:val="NormalWeb"/>
+        <w:jc w:val="both"/>
+      </w:pPr>
+      <w:r>
+        <w:t xml:space="preserve">Dans un contexte où l’intelligence artificielle (IA), le traitement du langage naturel (NLP) et l’analyse vectorielle deviennent des piliers de la transformation numérique, les bases de données traditionnelles évoluent pour intégrer ces nouvelles exigences. Oracle </w:t>
+      </w:r>
+      <w:proofErr w:type="spellStart"/>
+      <w:r>
+        <w:t>Database</w:t>
+      </w:r>
+      <w:proofErr w:type="spellEnd"/>
+      <w:r>
+        <w:t xml:space="preserve">, reconnu comme l’un des SGBD les plus robustes et évolutifs, a su suivre cette tendance en introduisant dans sa version 23ai une </w:t>
+      </w:r>
+      <w:r>
+        <w:rPr>
+          <w:rStyle w:val="lev"/>
+        </w:rPr>
+        <w:t>prise en charge native des vecteurs</w:t>
+      </w:r>
+      <w:r>
+        <w:t>.</w:t>
+      </w:r>
+    </w:p>
+    <w:p>
+      <w:pPr>
+        <w:pStyle w:val="NormalWeb"/>
+        <w:jc w:val="both"/>
+      </w:pPr>
+      <w:r>
+        <w:t xml:space="preserve">Cette évolution ouvre la voie à des cas d’usage avancés dans le domaine de la </w:t>
+      </w:r>
+      <w:r>
+        <w:rPr>
+          <w:rStyle w:val="lev"/>
+        </w:rPr>
+        <w:t>similarité sémantique</w:t>
+      </w:r>
+      <w:r>
+        <w:t xml:space="preserve">, de la </w:t>
+      </w:r>
+      <w:r>
+        <w:rPr>
+          <w:rStyle w:val="lev"/>
+        </w:rPr>
+        <w:t>recherche vectorielle</w:t>
+      </w:r>
+      <w:r>
+        <w:t xml:space="preserve"> ou encore de l’</w:t>
+      </w:r>
+      <w:r>
+        <w:rPr>
+          <w:rStyle w:val="lev"/>
+        </w:rPr>
+        <w:t>intégration IA dans les bases de données d’entreprise</w:t>
+      </w:r>
+      <w:r>
+        <w:t xml:space="preserve">. La maîtrise d’un tel environnement constitue une étape stratégique pour tout projet explorant les </w:t>
+      </w:r>
+      <w:r>
+        <w:rPr>
+          <w:rStyle w:val="lev"/>
+        </w:rPr>
+        <w:t>bases de données vectorielles avec Oracle</w:t>
+      </w:r>
+      <w:r>
+        <w:t>.</w:t>
+      </w:r>
+    </w:p>
+    <w:p>
+      <w:pPr>
+        <w:pStyle w:val="Titre2"/>
+        <w:rPr>
+          <w:rFonts w:ascii="Times New Roman" w:hAnsi="Times New Roman"/>
+          <w:b w:val="0"/>
+          <w:bCs/>
+          <w:sz w:val="24"/>
+          <w:szCs w:val="24"/>
+        </w:rPr>
+      </w:pPr>
+      <w:bookmarkStart w:id="74" w:name="_Toc211880984"/>
+      <w:bookmarkStart w:id="75" w:name="_Toc204310381"/>
       <w:r>
         <w:rPr>
           <w:rStyle w:val="lev"/>
@@ -17566,95 +17630,8 @@
           <w:sz w:val="24"/>
           <w:szCs w:val="24"/>
         </w:rPr>
-        <w:t>.1 Contexte et enjeux</w:t>
-      </w:r>
-      <w:bookmarkEnd w:id="72"/>
-      <w:bookmarkEnd w:id="73"/>
-    </w:p>
-    <w:p>
-      <w:pPr>
-        <w:pStyle w:val="NormalWeb"/>
-        <w:jc w:val="both"/>
-      </w:pPr>
-      <w:r>
-        <w:t xml:space="preserve">Dans un contexte où l’intelligence artificielle (IA), le traitement du langage naturel (NLP) et l’analyse vectorielle deviennent des piliers de la transformation numérique, les bases de données traditionnelles évoluent pour intégrer ces nouvelles exigences. Oracle </w:t>
-      </w:r>
-      <w:proofErr w:type="spellStart"/>
-      <w:r>
-        <w:t>Database</w:t>
-      </w:r>
-      <w:proofErr w:type="spellEnd"/>
-      <w:r>
-        <w:t xml:space="preserve">, reconnu comme l’un des SGBD les plus robustes et évolutifs, a su suivre cette tendance en introduisant dans sa version 23ai une </w:t>
-      </w:r>
-      <w:r>
-        <w:rPr>
-          <w:rStyle w:val="lev"/>
-        </w:rPr>
-        <w:t>prise en charge native des vecteurs</w:t>
-      </w:r>
-      <w:r>
-        <w:t>.</w:t>
-      </w:r>
-    </w:p>
-    <w:p>
-      <w:pPr>
-        <w:pStyle w:val="NormalWeb"/>
-        <w:jc w:val="both"/>
-      </w:pPr>
-      <w:r>
-        <w:t xml:space="preserve">Cette évolution ouvre la voie à des cas d’usage avancés dans le domaine de la </w:t>
-      </w:r>
-      <w:r>
-        <w:rPr>
-          <w:rStyle w:val="lev"/>
-        </w:rPr>
-        <w:t>similarité sémantique</w:t>
-      </w:r>
-      <w:r>
-        <w:t xml:space="preserve">, de la </w:t>
-      </w:r>
-      <w:r>
-        <w:rPr>
-          <w:rStyle w:val="lev"/>
-        </w:rPr>
-        <w:t>recherche vectorielle</w:t>
-      </w:r>
-      <w:r>
-        <w:t xml:space="preserve"> ou encore de l’</w:t>
-      </w:r>
-      <w:r>
-        <w:rPr>
-          <w:rStyle w:val="lev"/>
-        </w:rPr>
-        <w:t>intégration IA dans les bases de données d’entreprise</w:t>
-      </w:r>
-      <w:r>
-        <w:t xml:space="preserve">. La maîtrise d’un tel environnement constitue une étape stratégique pour tout projet explorant les </w:t>
-      </w:r>
-      <w:r>
-        <w:rPr>
-          <w:rStyle w:val="lev"/>
-        </w:rPr>
-        <w:t>bases de données vectorielles avec Oracle</w:t>
-      </w:r>
-      <w:r>
-        <w:t>.</w:t>
-      </w:r>
-    </w:p>
-    <w:p>
-      <w:pPr>
-        <w:pStyle w:val="Titre2"/>
-        <w:rPr>
-          <w:rFonts w:ascii="Times New Roman" w:hAnsi="Times New Roman"/>
-          <w:b w:val="0"/>
-          <w:bCs/>
-          <w:sz w:val="24"/>
-          <w:szCs w:val="24"/>
-        </w:rPr>
-      </w:pPr>
-      <w:bookmarkStart w:id="74" w:name="_Toc204310381"/>
-      <w:bookmarkStart w:id="75" w:name="_Toc211880984"/>
+        <w:t>6.</w:t>
+      </w:r>
       <w:r>
         <w:rPr>
           <w:rStyle w:val="lev"/>
@@ -17664,7 +17641,7 @@
           <w:sz w:val="24"/>
           <w:szCs w:val="24"/>
         </w:rPr>
-        <w:t>6</w:t>
+        <w:t>2</w:t>
       </w:r>
       <w:r>
         <w:rPr>
@@ -17675,8 +17652,9 @@
           <w:sz w:val="24"/>
           <w:szCs w:val="24"/>
         </w:rPr>
-        <w:t>.</w:t>
-      </w:r>
+        <w:t xml:space="preserve"> Objectifs de cette première phase</w:t>
+      </w:r>
+      <w:bookmarkEnd w:id="74"/>
       <w:r>
         <w:rPr>
           <w:rStyle w:val="lev"/>
@@ -17686,32 +17664,9 @@
           <w:sz w:val="24"/>
           <w:szCs w:val="24"/>
         </w:rPr>
-        <w:t>2</w:t>
-      </w:r>
-      <w:r>
-        <w:rPr>
-          <w:rStyle w:val="lev"/>
-          <w:rFonts w:ascii="Times New Roman" w:hAnsi="Times New Roman"/>
-          <w:b/>
-          <w:bCs w:val="0"/>
-          <w:sz w:val="24"/>
-          <w:szCs w:val="24"/>
-        </w:rPr>
-        <w:t xml:space="preserve"> Objectifs de cette première phase</w:t>
+        <w:t xml:space="preserve"> </w:t>
       </w:r>
       <w:bookmarkEnd w:id="75"/>
-      <w:r>
-        <w:rPr>
-          <w:rStyle w:val="lev"/>
-          <w:rFonts w:ascii="Times New Roman" w:hAnsi="Times New Roman"/>
-          <w:b/>
-          <w:bCs w:val="0"/>
-          <w:sz w:val="24"/>
-          <w:szCs w:val="24"/>
-        </w:rPr>
-        <w:t xml:space="preserve"> </w:t>
-      </w:r>
-      <w:bookmarkEnd w:id="74"/>
     </w:p>
     <w:p>
       <w:pPr>
@@ -32618,7 +32573,7 @@
         <w:jc w:val="both"/>
       </w:pPr>
       <w:r>
-        <w:t>Analyse de texte médical pour identifier les diagnostics les plus fréquents.</w:t>
+        <w:t>PCA pour visualiser la distribution des vecteurs.</w:t>
       </w:r>
     </w:p>
     <w:p>
@@ -32631,10 +32586,27 @@
         <w:spacing w:line="276" w:lineRule="auto"/>
         <w:jc w:val="both"/>
       </w:pPr>
-      <w:r>
-        <w:t>Regroupement de patients par similarité vectorielle (clustering).</w:t>
-      </w:r>
-    </w:p>
+      <w:bookmarkStart w:id="172" w:name="_Hlk212756439"/>
+      <w:r>
+        <w:t>Regroupement de patients par similarité vectorielle</w:t>
+      </w:r>
+      <w:r>
+        <w:t xml:space="preserve"> (</w:t>
+      </w:r>
+      <w:r>
+        <w:t>groupes thématiques</w:t>
+      </w:r>
+      <w:r>
+        <w:t xml:space="preserve">) avec </w:t>
+      </w:r>
+      <w:r>
+        <w:t>DBSCAN</w:t>
+      </w:r>
+      <w:r>
+        <w:t>.</w:t>
+      </w:r>
+    </w:p>
+    <w:bookmarkEnd w:id="172"/>
     <w:p>
       <w:pPr>
         <w:pStyle w:val="NormalWeb"/>
@@ -32659,7 +32631,7 @@
           <w:szCs w:val="24"/>
         </w:rPr>
       </w:pPr>
-      <w:bookmarkStart w:id="172" w:name="_Toc211881037"/>
+      <w:bookmarkStart w:id="173" w:name="_Toc211881037"/>
       <w:r>
         <w:rPr>
           <w:rFonts w:ascii="Times New Roman" w:hAnsi="Times New Roman"/>
@@ -32674,18 +32646,269 @@
           <w:sz w:val="24"/>
           <w:szCs w:val="24"/>
         </w:rPr>
-        <w:t>.4.2 Analyses Python et interfaçage avec Oracle</w:t>
-      </w:r>
-      <w:bookmarkEnd w:id="172"/>
-    </w:p>
+        <w:t>.4.</w:t>
+      </w:r>
+      <w:r>
+        <w:rPr>
+          <w:rFonts w:ascii="Times New Roman" w:hAnsi="Times New Roman"/>
+          <w:sz w:val="24"/>
+          <w:szCs w:val="24"/>
+        </w:rPr>
+        <w:t>1.1</w:t>
+      </w:r>
+      <w:r>
+        <w:rPr>
+          <w:rFonts w:ascii="Times New Roman" w:hAnsi="Times New Roman"/>
+          <w:sz w:val="24"/>
+          <w:szCs w:val="24"/>
+        </w:rPr>
+        <w:t xml:space="preserve"> </w:t>
+      </w:r>
+      <w:bookmarkEnd w:id="173"/>
+      <w:r>
+        <w:rPr>
+          <w:rFonts w:ascii="Times New Roman" w:hAnsi="Times New Roman"/>
+          <w:i w:val="0"/>
+          <w:iCs/>
+          <w:sz w:val="24"/>
+          <w:szCs w:val="24"/>
+        </w:rPr>
+        <w:t>PCA pour visualiser la distribution des vecteurs</w:t>
+      </w:r>
+      <w:r>
+        <w:rPr>
+          <w:rFonts w:ascii="Times New Roman" w:hAnsi="Times New Roman"/>
+          <w:sz w:val="24"/>
+          <w:szCs w:val="24"/>
+        </w:rPr>
+        <w:t xml:space="preserve"> </w:t>
+      </w:r>
+    </w:p>
+    <w:p>
+      <w:pPr>
+        <w:rPr>
+          <w:rFonts w:ascii="Times New Roman" w:hAnsi="Times New Roman"/>
+          <w:sz w:val="24"/>
+          <w:szCs w:val="24"/>
+        </w:rPr>
+      </w:pPr>
+      <w:r>
+        <w:rPr>
+          <w:rFonts w:ascii="Times New Roman" w:hAnsi="Times New Roman"/>
+          <w:sz w:val="24"/>
+          <w:szCs w:val="24"/>
+        </w:rPr>
+        <w:t>Les Données son</w:t>
+      </w:r>
+      <w:r>
+        <w:rPr>
+          <w:rFonts w:ascii="Times New Roman" w:hAnsi="Times New Roman"/>
+          <w:sz w:val="24"/>
+          <w:szCs w:val="24"/>
+        </w:rPr>
+        <w:t xml:space="preserve">t </w:t>
+      </w:r>
+      <w:r>
+        <w:rPr>
+          <w:rFonts w:ascii="Times New Roman" w:hAnsi="Times New Roman"/>
+          <w:sz w:val="24"/>
+          <w:szCs w:val="24"/>
+        </w:rPr>
+        <w:t xml:space="preserve">récupérées </w:t>
+      </w:r>
+      <w:r>
+        <w:rPr>
+          <w:rFonts w:ascii="Times New Roman" w:hAnsi="Times New Roman"/>
+          <w:sz w:val="24"/>
+          <w:szCs w:val="24"/>
+        </w:rPr>
+        <w:t>depuis la base de données Oracle</w:t>
+      </w:r>
+      <w:r>
+        <w:rPr>
+          <w:rFonts w:ascii="Times New Roman" w:hAnsi="Times New Roman"/>
+          <w:sz w:val="24"/>
+          <w:szCs w:val="24"/>
+        </w:rPr>
+        <w:t xml:space="preserve"> et traiter</w:t>
+      </w:r>
+      <w:r>
+        <w:rPr>
+          <w:rFonts w:ascii="Times New Roman" w:hAnsi="Times New Roman"/>
+          <w:sz w:val="24"/>
+          <w:szCs w:val="24"/>
+        </w:rPr>
+        <w:t xml:space="preserve"> </w:t>
+      </w:r>
+      <w:r>
+        <w:rPr>
+          <w:rFonts w:ascii="Times New Roman" w:hAnsi="Times New Roman"/>
+          <w:sz w:val="24"/>
+          <w:szCs w:val="24"/>
+        </w:rPr>
+        <w:t xml:space="preserve">avec python </w:t>
+      </w:r>
+    </w:p>
+    <w:p>
+      <w:pPr>
+        <w:rPr>
+          <w:rFonts w:ascii="Times New Roman" w:hAnsi="Times New Roman"/>
+          <w:sz w:val="24"/>
+          <w:szCs w:val="24"/>
+        </w:rPr>
+      </w:pPr>
+    </w:p>
+    <w:p>
+      <w:pPr>
+        <w:rPr>
+          <w:rFonts w:ascii="Times New Roman" w:hAnsi="Times New Roman"/>
+          <w:sz w:val="24"/>
+          <w:szCs w:val="24"/>
+        </w:rPr>
+      </w:pPr>
+      <w:r>
+        <w:rPr>
+          <w:rFonts w:ascii="Times New Roman" w:hAnsi="Times New Roman"/>
+          <w:sz w:val="24"/>
+          <w:szCs w:val="24"/>
+        </w:rPr>
+        <w:drawing>
+          <wp:inline distT="0" distB="0" distL="0" distR="0" wp14:anchorId="59FB0E6A" wp14:editId="0F64E502">
+            <wp:extent cx="6239746" cy="5973009"/>
+            <wp:effectExtent l="0" t="0" r="8890" b="8890"/>
+            <wp:docPr id="28" name="Image 28"/>
+            <wp:cNvGraphicFramePr>
+              <a:graphicFrameLocks xmlns:a="http://schemas.openxmlformats.org/drawingml/2006/main" noChangeAspect="1"/>
+            </wp:cNvGraphicFramePr>
+            <a:graphic xmlns:a="http://schemas.openxmlformats.org/drawingml/2006/main">
+              <a:graphicData uri="http://schemas.openxmlformats.org/drawingml/2006/picture">
+                <pic:pic xmlns:pic="http://schemas.openxmlformats.org/drawingml/2006/picture">
+                  <pic:nvPicPr>
+                    <pic:cNvPr id="1" name=""/>
+                    <pic:cNvPicPr/>
+                  </pic:nvPicPr>
+                  <pic:blipFill>
+                    <a:blip r:embed="rId38"/>
+                    <a:stretch>
+                      <a:fillRect/>
+                    </a:stretch>
+                  </pic:blipFill>
+                  <pic:spPr>
+                    <a:xfrm>
+                      <a:off x="0" y="0"/>
+                      <a:ext cx="6239746" cy="5973009"/>
+                    </a:xfrm>
+                    <a:prstGeom prst="rect">
+                      <a:avLst/>
+                    </a:prstGeom>
+                  </pic:spPr>
+                </pic:pic>
+              </a:graphicData>
+            </a:graphic>
+          </wp:inline>
+        </w:drawing>
+      </w:r>
+    </w:p>
+    <w:p/>
+    <w:p>
+      <w:pPr>
+        <w:rPr>
+          <w:sz w:val="24"/>
+          <w:szCs w:val="24"/>
+        </w:rPr>
+      </w:pPr>
+    </w:p>
+    <w:p>
+      <w:pPr>
+        <w:tabs>
+          <w:tab w:val="left" w:pos="5730"/>
+        </w:tabs>
+        <w:rPr>
+          <w:sz w:val="24"/>
+          <w:szCs w:val="24"/>
+        </w:rPr>
+      </w:pPr>
+      <w:r>
+        <w:rPr>
+          <w:sz w:val="24"/>
+          <w:szCs w:val="24"/>
+        </w:rPr>
+        <w:t>L’analyse PCA ici nous montre les résultats suivants :</w:t>
+      </w:r>
+      <w:r>
+        <w:rPr>
+          <w:sz w:val="24"/>
+          <w:szCs w:val="24"/>
+        </w:rPr>
+        <w:tab/>
+      </w:r>
+    </w:p>
+    <w:p>
+      <w:r>
+        <w:drawing>
+          <wp:inline distT="0" distB="0" distL="0" distR="0" wp14:anchorId="7B50A42B" wp14:editId="1F9FB4C3">
+            <wp:extent cx="6645910" cy="5527675"/>
+            <wp:effectExtent l="0" t="0" r="2540" b="0"/>
+            <wp:docPr id="32" name="Image 32"/>
+            <wp:cNvGraphicFramePr>
+              <a:graphicFrameLocks xmlns:a="http://schemas.openxmlformats.org/drawingml/2006/main" noChangeAspect="1"/>
+            </wp:cNvGraphicFramePr>
+            <a:graphic xmlns:a="http://schemas.openxmlformats.org/drawingml/2006/main">
+              <a:graphicData uri="http://schemas.openxmlformats.org/drawingml/2006/picture">
+                <pic:pic xmlns:pic="http://schemas.openxmlformats.org/drawingml/2006/picture">
+                  <pic:nvPicPr>
+                    <pic:cNvPr id="1" name=""/>
+                    <pic:cNvPicPr/>
+                  </pic:nvPicPr>
+                  <pic:blipFill>
+                    <a:blip r:embed="rId39"/>
+                    <a:stretch>
+                      <a:fillRect/>
+                    </a:stretch>
+                  </pic:blipFill>
+                  <pic:spPr>
+                    <a:xfrm>
+                      <a:off x="0" y="0"/>
+                      <a:ext cx="6645910" cy="5527675"/>
+                    </a:xfrm>
+                    <a:prstGeom prst="rect">
+                      <a:avLst/>
+                    </a:prstGeom>
+                  </pic:spPr>
+                </pic:pic>
+              </a:graphicData>
+            </a:graphic>
+          </wp:inline>
+        </w:drawing>
+      </w:r>
+    </w:p>
+    <w:p/>
+    <w:p/>
     <w:p>
       <w:pPr>
         <w:pStyle w:val="NormalWeb"/>
-        <w:spacing w:line="276" w:lineRule="auto"/>
-        <w:jc w:val="both"/>
-      </w:pPr>
-      <w:r>
-        <w:t>Des notebooks Python connectés à Oracle permettent de réaliser des analyses complémentaires :</w:t>
+      </w:pPr>
+      <w:r>
+        <w:rPr>
+          <w:rFonts w:hAnsi="Symbol"/>
+        </w:rPr>
+        <w:t></w:t>
+      </w:r>
+      <w:r>
+        <w:t xml:space="preserve"> </w:t>
+      </w:r>
+      <w:r>
+        <w:rPr>
+          <w:b/>
+          <w:bCs/>
+        </w:rPr>
+        <w:t>Axes</w:t>
+      </w:r>
+      <w:r>
+        <w:rPr>
+          <w:rStyle w:val="lev"/>
+        </w:rPr>
+        <w:t xml:space="preserve"> principaux :</w:t>
       </w:r>
     </w:p>
     <w:p>
@@ -32693,13 +32916,38 @@
         <w:pStyle w:val="NormalWeb"/>
         <w:numPr>
           <w:ilvl w:val="0"/>
-          <w:numId w:val="64"/>
+          <w:numId w:val="76"/>
         </w:numPr>
-        <w:spacing w:line="276" w:lineRule="auto"/>
-        <w:jc w:val="both"/>
-      </w:pPr>
-      <w:r>
-        <w:t>PCA pour visualiser la distribution des vecteurs.</w:t>
+      </w:pPr>
+      <w:r>
+        <w:t xml:space="preserve">L’axe </w:t>
+      </w:r>
+      <w:r>
+        <w:rPr>
+          <w:rStyle w:val="lev"/>
+        </w:rPr>
+        <w:t>X (Composante principale 1)</w:t>
+      </w:r>
+      <w:r>
+        <w:t xml:space="preserve"> et l’axe </w:t>
+      </w:r>
+      <w:r>
+        <w:rPr>
+          <w:rStyle w:val="lev"/>
+        </w:rPr>
+        <w:t>Y (Composante principale 2)</w:t>
+      </w:r>
+      <w:r>
+        <w:t xml:space="preserve"> représentent les </w:t>
+      </w:r>
+      <w:r>
+        <w:rPr>
+          <w:rStyle w:val="lev"/>
+        </w:rPr>
+        <w:t>deux directions de variance maximale</w:t>
+      </w:r>
+      <w:r>
+        <w:t xml:space="preserve"> dans tes données.</w:t>
       </w:r>
     </w:p>
     <w:p>
@@ -32707,13 +32955,38 @@
         <w:pStyle w:val="NormalWeb"/>
         <w:numPr>
           <w:ilvl w:val="0"/>
-          <w:numId w:val="64"/>
+          <w:numId w:val="76"/>
         </w:numPr>
-        <w:spacing w:line="276" w:lineRule="auto"/>
-        <w:jc w:val="both"/>
-      </w:pPr>
-      <w:r>
-        <w:t>DBSCAN/LDA pour identifier des groupes thématiques.</w:t>
+      </w:pPr>
+      <w:r>
+        <w:t>Autrement dit, ces axes concentrent le maximum d’information des vecteurs d’origine (souvent des centaines de dimensions).</w:t>
+      </w:r>
+    </w:p>
+    <w:p>
+      <w:pPr>
+        <w:pStyle w:val="NormalWeb"/>
+      </w:pPr>
+      <w:r>
+        <w:rPr>
+          <w:rFonts w:hAnsi="Symbol"/>
+        </w:rPr>
+        <w:t></w:t>
+      </w:r>
+      <w:r>
+        <w:t xml:space="preserve"> </w:t>
+      </w:r>
+      <w:r>
+        <w:rPr>
+          <w:b/>
+          <w:bCs/>
+        </w:rPr>
+        <w:t>Répartition</w:t>
+      </w:r>
+      <w:r>
+        <w:rPr>
+          <w:rStyle w:val="lev"/>
+        </w:rPr>
+        <w:t xml:space="preserve"> des points :</w:t>
       </w:r>
     </w:p>
     <w:p>
@@ -32721,20 +32994,339 @@
         <w:pStyle w:val="NormalWeb"/>
         <w:numPr>
           <w:ilvl w:val="0"/>
-          <w:numId w:val="64"/>
+          <w:numId w:val="77"/>
         </w:numPr>
+      </w:pPr>
+      <w:r>
+        <w:t xml:space="preserve">Les points </w:t>
+      </w:r>
+      <w:r>
+        <w:rPr>
+          <w:rStyle w:val="lev"/>
+        </w:rPr>
+        <w:t>proches les uns des autres</w:t>
+      </w:r>
+      <w:r>
+        <w:t xml:space="preserve"> représentent des </w:t>
+      </w:r>
+      <w:r>
+        <w:rPr>
+          <w:rStyle w:val="lev"/>
+        </w:rPr>
+        <w:t>vecteurs (</w:t>
+      </w:r>
+      <w:r>
+        <w:rPr>
+          <w:rStyle w:val="lev"/>
+        </w:rPr>
+        <w:t xml:space="preserve">patients) </w:t>
+      </w:r>
+      <w:r>
+        <w:rPr>
+          <w:rStyle w:val="lev"/>
+        </w:rPr>
+        <w:t xml:space="preserve">ayant </w:t>
+      </w:r>
+      <w:r>
+        <w:rPr>
+          <w:rStyle w:val="lev"/>
+        </w:rPr>
+        <w:t xml:space="preserve">des </w:t>
+      </w:r>
+      <w:r>
+        <w:rPr>
+          <w:b/>
+          <w:bCs/>
+        </w:rPr>
+        <w:t xml:space="preserve">diagnostics </w:t>
+      </w:r>
+      <w:r>
+        <w:rPr>
+          <w:rStyle w:val="lev"/>
+        </w:rPr>
+        <w:t xml:space="preserve">très similaires </w:t>
+      </w:r>
+    </w:p>
+    <w:p>
+      <w:pPr>
+        <w:pStyle w:val="NormalWeb"/>
+        <w:numPr>
+          <w:ilvl w:val="0"/>
+          <w:numId w:val="77"/>
+        </w:numPr>
+      </w:pPr>
+      <w:r>
+        <w:t xml:space="preserve">Les points </w:t>
+      </w:r>
+      <w:r>
+        <w:rPr>
+          <w:rStyle w:val="lev"/>
+        </w:rPr>
+        <w:t>éloignés</w:t>
+      </w:r>
+      <w:r>
+        <w:t xml:space="preserve"> traduisent </w:t>
+      </w:r>
+      <w:r>
+        <w:rPr>
+          <w:b/>
+          <w:bCs/>
+        </w:rPr>
+        <w:t>des patients avec des cas particuliers</w:t>
+      </w:r>
+      <w:r>
+        <w:t>.</w:t>
+      </w:r>
+    </w:p>
+    <w:p>
+      <w:pPr>
+        <w:pStyle w:val="NormalWeb"/>
+      </w:pPr>
+      <w:r>
+        <w:rPr>
+          <w:rFonts w:hAnsi="Symbol"/>
+        </w:rPr>
+        <w:t></w:t>
+      </w:r>
+      <w:r>
+        <w:t xml:space="preserve"> </w:t>
+      </w:r>
+      <w:r>
+        <w:rPr>
+          <w:b/>
+          <w:bCs/>
+        </w:rPr>
+        <w:t>Groupes</w:t>
+      </w:r>
+      <w:r>
+        <w:rPr>
+          <w:rStyle w:val="lev"/>
+          <w:b w:val="0"/>
+          <w:bCs w:val="0"/>
+        </w:rPr>
+        <w:t xml:space="preserve"> </w:t>
+      </w:r>
+      <w:r>
+        <w:rPr>
+          <w:rStyle w:val="lev"/>
+        </w:rPr>
+        <w:t>visibles :</w:t>
+      </w:r>
+    </w:p>
+    <w:p>
+      <w:pPr>
+        <w:pStyle w:val="NormalWeb"/>
+        <w:numPr>
+          <w:ilvl w:val="0"/>
+          <w:numId w:val="78"/>
+        </w:numPr>
+      </w:pPr>
+      <w:r>
+        <w:t xml:space="preserve">On observe plusieurs </w:t>
+      </w:r>
+      <w:r>
+        <w:rPr>
+          <w:rStyle w:val="lev"/>
+        </w:rPr>
+        <w:t>zones de regroupement</w:t>
+      </w:r>
+      <w:r>
+        <w:t xml:space="preserve"> (clusters naturels) :</w:t>
+      </w:r>
+    </w:p>
+    <w:p>
+      <w:pPr>
+        <w:pStyle w:val="NormalWeb"/>
+        <w:numPr>
+          <w:ilvl w:val="1"/>
+          <w:numId w:val="78"/>
+        </w:numPr>
+      </w:pPr>
+      <w:r>
+        <w:t xml:space="preserve">Par exemple, autour de la zone </w:t>
+      </w:r>
+      <w:r>
+        <w:rPr>
+          <w:rStyle w:val="lev"/>
+        </w:rPr>
+        <w:t>(-0.4, -0.2)</w:t>
+      </w:r>
+      <w:r>
+        <w:t xml:space="preserve"> et </w:t>
+      </w:r>
+      <w:r>
+        <w:rPr>
+          <w:rStyle w:val="lev"/>
+        </w:rPr>
+        <w:t xml:space="preserve">(0.3, </w:t>
+      </w:r>
+      <w:r>
+        <w:rPr>
+          <w:rStyle w:val="lev"/>
+        </w:rPr>
+        <w:t>-0.4</w:t>
+      </w:r>
+      <w:r>
+        <w:rPr>
+          <w:rStyle w:val="lev"/>
+        </w:rPr>
+        <w:t>)</w:t>
+      </w:r>
+      <w:r>
+        <w:t>.</w:t>
+      </w:r>
+    </w:p>
+    <w:p>
+      <w:pPr>
+        <w:pStyle w:val="NormalWeb"/>
+        <w:numPr>
+          <w:ilvl w:val="1"/>
+          <w:numId w:val="78"/>
+        </w:numPr>
+      </w:pPr>
+      <w:r>
+        <w:t>Cela suggère qu’il existe des sous-groupes de vecteurs</w:t>
+      </w:r>
+      <w:r>
+        <w:t xml:space="preserve"> (patients)</w:t>
+      </w:r>
+      <w:r>
+        <w:t xml:space="preserve"> ayant des</w:t>
+      </w:r>
+      <w:r>
+        <w:t xml:space="preserve"> </w:t>
+      </w:r>
+      <w:bookmarkStart w:id="174" w:name="_Hlk212756662"/>
+      <w:r>
+        <w:t>diagnostics</w:t>
+      </w:r>
+      <w:r>
+        <w:t xml:space="preserve"> </w:t>
+      </w:r>
+      <w:bookmarkEnd w:id="174"/>
+      <w:r>
+        <w:t>proches.</w:t>
+      </w:r>
+    </w:p>
+    <w:p>
+      <w:pPr>
+        <w:pStyle w:val="NormalWeb"/>
+        <w:numPr>
+          <w:ilvl w:val="0"/>
+          <w:numId w:val="78"/>
+        </w:numPr>
+      </w:pPr>
+      <w:r>
+        <w:t xml:space="preserve">Les points isolés comme </w:t>
+      </w:r>
+      <w:r>
+        <w:rPr>
+          <w:rStyle w:val="lev"/>
+        </w:rPr>
+        <w:t>ID 1, 20 ou 91</w:t>
+      </w:r>
+      <w:r>
+        <w:t xml:space="preserve"> peuvent être </w:t>
+      </w:r>
+      <w:r>
+        <w:t xml:space="preserve">patients avec des diagnostics à part </w:t>
+      </w:r>
+    </w:p>
+    <w:p>
+      <w:pPr>
+        <w:pStyle w:val="NormalWeb"/>
+      </w:pPr>
+      <w:r>
+        <w:rPr>
+          <w:rFonts w:hAnsi="Symbol"/>
+        </w:rPr>
+        <w:t></w:t>
+      </w:r>
+      <w:r>
+        <w:t xml:space="preserve"> </w:t>
+      </w:r>
+      <w:r>
+        <w:rPr>
+          <w:b/>
+          <w:bCs/>
+        </w:rPr>
+        <w:t>Valeurs</w:t>
+      </w:r>
+      <w:r>
+        <w:rPr>
+          <w:rStyle w:val="lev"/>
+        </w:rPr>
+        <w:t xml:space="preserve"> centrées :</w:t>
+      </w:r>
+    </w:p>
+    <w:p>
+      <w:pPr>
+        <w:pStyle w:val="NormalWeb"/>
+        <w:numPr>
+          <w:ilvl w:val="0"/>
+          <w:numId w:val="79"/>
+        </w:numPr>
+      </w:pPr>
+      <w:r>
+        <w:t>Les vecteurs sont bien centrés autour de (0,0), ce qui indique que le PCA a correctement normalisé les composantes principales.</w:t>
+      </w:r>
+    </w:p>
+    <w:p/>
+    <w:p>
+      <w:pPr>
+        <w:pStyle w:val="Titre3"/>
+        <w:rPr>
+          <w:rFonts w:ascii="Times New Roman" w:hAnsi="Times New Roman"/>
+          <w:i w:val="0"/>
+          <w:iCs/>
+          <w:sz w:val="24"/>
+          <w:szCs w:val="24"/>
+        </w:rPr>
+      </w:pPr>
+      <w:bookmarkStart w:id="175" w:name="_Toc211881038"/>
+      <w:r>
+        <w:rPr>
+          <w:rFonts w:ascii="Times New Roman" w:hAnsi="Times New Roman"/>
+          <w:i w:val="0"/>
+          <w:iCs/>
+          <w:sz w:val="24"/>
+          <w:szCs w:val="24"/>
+        </w:rPr>
+        <w:t>8.4.1.</w:t>
+      </w:r>
+      <w:r>
+        <w:rPr>
+          <w:rFonts w:ascii="Times New Roman" w:hAnsi="Times New Roman"/>
+          <w:i w:val="0"/>
+          <w:iCs/>
+          <w:sz w:val="24"/>
+          <w:szCs w:val="24"/>
+        </w:rPr>
+        <w:t>2</w:t>
+      </w:r>
+      <w:r>
+        <w:rPr>
+          <w:rFonts w:ascii="Times New Roman" w:hAnsi="Times New Roman"/>
+          <w:i w:val="0"/>
+          <w:iCs/>
+          <w:sz w:val="24"/>
+          <w:szCs w:val="24"/>
+        </w:rPr>
+        <w:t xml:space="preserve"> Regroupement de patients par similarité vectorielle (groupes thématiques) avec DBSCAN.</w:t>
+      </w:r>
+    </w:p>
+    <w:p>
+      <w:pPr>
+        <w:pStyle w:val="Titre3"/>
         <w:spacing w:line="276" w:lineRule="auto"/>
-        <w:jc w:val="both"/>
-      </w:pPr>
-      <w:proofErr w:type="spellStart"/>
-      <w:r>
-        <w:t>Dashboards</w:t>
-      </w:r>
-      <w:proofErr w:type="spellEnd"/>
-      <w:r>
-        <w:t xml:space="preserve"> Streamlit pour l’exploration interactive.</w:t>
-      </w:r>
-    </w:p>
+        <w:rPr>
+          <w:rFonts w:ascii="Times New Roman" w:hAnsi="Times New Roman"/>
+          <w:sz w:val="24"/>
+          <w:szCs w:val="24"/>
+        </w:rPr>
+      </w:pPr>
+    </w:p>
+    <w:p/>
     <w:p>
       <w:pPr>
         <w:pStyle w:val="Titre2"/>
@@ -32745,13 +33337,24 @@
           <w:szCs w:val="24"/>
         </w:rPr>
       </w:pPr>
-      <w:bookmarkStart w:id="173" w:name="_Toc211881038"/>
-      <w:r>
+    </w:p>
+    <w:p/>
+    <w:p>
+      <w:pPr>
+        <w:pStyle w:val="Titre2"/>
+        <w:spacing w:line="276" w:lineRule="auto"/>
         <w:rPr>
           <w:rFonts w:ascii="Times New Roman" w:hAnsi="Times New Roman"/>
           <w:sz w:val="24"/>
           <w:szCs w:val="24"/>
         </w:rPr>
+      </w:pPr>
+      <w:r>
+        <w:rPr>
+          <w:rFonts w:ascii="Times New Roman" w:hAnsi="Times New Roman"/>
+          <w:sz w:val="24"/>
+          <w:szCs w:val="24"/>
+        </w:rPr>
         <w:t>8</w:t>
       </w:r>
       <w:r>
@@ -32762,7 +33365,7 @@
         </w:rPr>
         <w:t>.5 Apport de l’intégration Oracle 23AI dans un Data Lake</w:t>
       </w:r>
-      <w:bookmarkEnd w:id="173"/>
+      <w:bookmarkEnd w:id="175"/>
     </w:p>
     <w:p>
       <w:pPr>
@@ -32892,7 +33495,7 @@
           <w:szCs w:val="24"/>
         </w:rPr>
       </w:pPr>
-      <w:bookmarkStart w:id="174" w:name="_Toc211881039"/>
+      <w:bookmarkStart w:id="176" w:name="_Toc211881039"/>
       <w:r>
         <w:rPr>
           <w:rFonts w:ascii="Times New Roman" w:hAnsi="Times New Roman"/>
@@ -32901,7 +33504,7 @@
         </w:rPr>
         <w:t>6.6 Conclusion</w:t>
       </w:r>
-      <w:bookmarkEnd w:id="174"/>
+      <w:bookmarkEnd w:id="176"/>
     </w:p>
     <w:p>
       <w:pPr>
@@ -32935,8 +33538,8 @@
       <w:pPr>
         <w:pStyle w:val="Titre1"/>
       </w:pPr>
-      <w:bookmarkStart w:id="175" w:name="_Toc207077070"/>
-      <w:bookmarkStart w:id="176" w:name="_Toc211881040"/>
+      <w:bookmarkStart w:id="177" w:name="_Toc207077070"/>
+      <w:bookmarkStart w:id="178" w:name="_Toc211881040"/>
       <w:r>
         <w:t>Conclusion générale</w:t>
       </w:r>
@@ -32945,300 +33548,300 @@
       </w:r>
       <w:r>
         <w:t>s</w:t>
-      </w:r>
-      <w:bookmarkEnd w:id="175"/>
-      <w:bookmarkEnd w:id="176"/>
-    </w:p>
-    <w:p>
-      <w:pPr>
-        <w:rPr>
-          <w:bCs/>
-          <w:sz w:val="24"/>
-          <w:szCs w:val="24"/>
-        </w:rPr>
-      </w:pPr>
-    </w:p>
-    <w:p>
-      <w:pPr>
-        <w:ind w:left="1134"/>
-        <w:rPr>
-          <w:sz w:val="24"/>
-          <w:szCs w:val="24"/>
-        </w:rPr>
-      </w:pPr>
-      <w:r>
-        <w:rPr>
-          <w:sz w:val="24"/>
-          <w:szCs w:val="24"/>
-        </w:rPr>
-        <w:t xml:space="preserve">Principaux apports </w:t>
-      </w:r>
-      <w:r>
-        <w:rPr>
-          <w:sz w:val="24"/>
-          <w:szCs w:val="24"/>
-        </w:rPr>
-        <w:t>de l’étude</w:t>
-      </w:r>
-      <w:r>
-        <w:rPr>
-          <w:sz w:val="24"/>
-          <w:szCs w:val="24"/>
-        </w:rPr>
-        <w:t xml:space="preserve"> pour vous, pour l’entreprise</w:t>
-      </w:r>
-      <w:r>
-        <w:rPr>
-          <w:sz w:val="24"/>
-          <w:szCs w:val="24"/>
-        </w:rPr>
-        <w:t xml:space="preserve"> ou celui qui a défini le sujet</w:t>
-      </w:r>
-      <w:r>
-        <w:rPr>
-          <w:sz w:val="24"/>
-          <w:szCs w:val="24"/>
-        </w:rPr>
-        <w:t>, pour l’école</w:t>
-      </w:r>
-    </w:p>
-    <w:p>
-      <w:pPr>
-        <w:ind w:left="1418" w:hanging="284"/>
-        <w:rPr>
-          <w:sz w:val="24"/>
-          <w:szCs w:val="24"/>
-        </w:rPr>
-      </w:pPr>
-      <w:r>
-        <w:rPr>
-          <w:sz w:val="24"/>
-          <w:szCs w:val="24"/>
-        </w:rPr>
-        <w:t>Précisions sur le travail réalisé</w:t>
-      </w:r>
-      <w:r>
-        <w:rPr>
-          <w:sz w:val="24"/>
-          <w:szCs w:val="24"/>
-        </w:rPr>
-        <w:t> </w:t>
-      </w:r>
-      <w:r>
-        <w:rPr>
-          <w:sz w:val="24"/>
-          <w:szCs w:val="24"/>
-        </w:rPr>
-        <w:t>(</w:t>
-      </w:r>
-      <w:r>
-        <w:rPr>
-          <w:sz w:val="24"/>
-          <w:szCs w:val="24"/>
-        </w:rPr>
-        <w:t xml:space="preserve">état de l’art, installation, étude </w:t>
-      </w:r>
-      <w:r>
-        <w:rPr>
-          <w:sz w:val="24"/>
-          <w:szCs w:val="24"/>
-        </w:rPr>
-        <w:t>ORACLE 23AI ET LES BD VECTORIELS</w:t>
-      </w:r>
-      <w:r>
-        <w:rPr>
-          <w:sz w:val="24"/>
-          <w:szCs w:val="24"/>
-        </w:rPr>
-        <w:t xml:space="preserve">, </w:t>
-      </w:r>
-      <w:r>
-        <w:rPr>
-          <w:sz w:val="24"/>
-          <w:szCs w:val="24"/>
-        </w:rPr>
-        <w:t xml:space="preserve">mise en œuvre du cas d’usage, intégration dans l’environnement </w:t>
-      </w:r>
-      <w:proofErr w:type="spellStart"/>
-      <w:r>
-        <w:rPr>
-          <w:sz w:val="24"/>
-          <w:szCs w:val="24"/>
-        </w:rPr>
-        <w:t>Bigdata</w:t>
-      </w:r>
-      <w:proofErr w:type="spellEnd"/>
-      <w:r>
-        <w:rPr>
-          <w:sz w:val="24"/>
-          <w:szCs w:val="24"/>
-        </w:rPr>
-        <w:t xml:space="preserve">, </w:t>
-      </w:r>
-      <w:r>
-        <w:rPr>
-          <w:sz w:val="24"/>
-          <w:szCs w:val="24"/>
-        </w:rPr>
-        <w:t>...)</w:t>
-      </w:r>
-    </w:p>
-    <w:p>
-      <w:pPr>
-        <w:ind w:left="1134"/>
-        <w:rPr>
-          <w:sz w:val="24"/>
-          <w:szCs w:val="24"/>
-        </w:rPr>
-      </w:pPr>
-      <w:r>
-        <w:rPr>
-          <w:sz w:val="24"/>
-          <w:szCs w:val="24"/>
-        </w:rPr>
-        <w:t>Précisions sur la situation finale d</w:t>
-      </w:r>
-      <w:r>
-        <w:rPr>
-          <w:sz w:val="24"/>
-          <w:szCs w:val="24"/>
-        </w:rPr>
-        <w:t>u travail</w:t>
-      </w:r>
-      <w:r>
-        <w:rPr>
-          <w:sz w:val="24"/>
-          <w:szCs w:val="24"/>
-        </w:rPr>
-        <w:t xml:space="preserve"> réalisée (</w:t>
-      </w:r>
-      <w:r>
-        <w:rPr>
-          <w:sz w:val="24"/>
-          <w:szCs w:val="24"/>
-        </w:rPr>
-        <w:t xml:space="preserve">Le statu des livrables </w:t>
-      </w:r>
-      <w:r>
-        <w:rPr>
-          <w:sz w:val="24"/>
-          <w:szCs w:val="24"/>
-        </w:rPr>
-        <w:t xml:space="preserve">en </w:t>
-      </w:r>
-      <w:r>
-        <w:rPr>
-          <w:sz w:val="24"/>
-          <w:szCs w:val="24"/>
-        </w:rPr>
-        <w:t>production</w:t>
-      </w:r>
-      <w:r>
-        <w:rPr>
-          <w:sz w:val="24"/>
-          <w:szCs w:val="24"/>
-        </w:rPr>
-        <w:t xml:space="preserve">, ..., </w:t>
-      </w:r>
-      <w:r>
-        <w:rPr>
-          <w:sz w:val="24"/>
-          <w:szCs w:val="24"/>
-        </w:rPr>
-        <w:t xml:space="preserve">en </w:t>
-      </w:r>
-      <w:proofErr w:type="gramStart"/>
-      <w:r>
-        <w:rPr>
-          <w:sz w:val="24"/>
-          <w:szCs w:val="24"/>
-        </w:rPr>
-        <w:t>test,  fini</w:t>
-      </w:r>
-      <w:proofErr w:type="gramEnd"/>
-      <w:r>
-        <w:rPr>
-          <w:sz w:val="24"/>
-          <w:szCs w:val="24"/>
-        </w:rPr>
-        <w:t xml:space="preserve"> à X %</w:t>
-      </w:r>
-      <w:r>
-        <w:rPr>
-          <w:sz w:val="24"/>
-          <w:szCs w:val="24"/>
-        </w:rPr>
-        <w:t>)</w:t>
-      </w:r>
-    </w:p>
-    <w:p>
-      <w:pPr>
-        <w:ind w:left="1134"/>
-        <w:rPr>
-          <w:sz w:val="24"/>
-          <w:szCs w:val="24"/>
-        </w:rPr>
-      </w:pPr>
-      <w:r>
-        <w:rPr>
-          <w:sz w:val="24"/>
-          <w:szCs w:val="24"/>
-        </w:rPr>
-        <w:t>Principales difficultés rencontrées</w:t>
-      </w:r>
-      <w:r>
-        <w:rPr>
-          <w:sz w:val="24"/>
-          <w:szCs w:val="24"/>
-        </w:rPr>
-        <w:t xml:space="preserve"> et solutions apportées</w:t>
-      </w:r>
-    </w:p>
-    <w:p>
-      <w:pPr>
-        <w:ind w:left="1134"/>
-        <w:rPr>
-          <w:sz w:val="24"/>
-          <w:szCs w:val="24"/>
-        </w:rPr>
-      </w:pPr>
-      <w:r>
-        <w:rPr>
-          <w:sz w:val="24"/>
-          <w:szCs w:val="24"/>
-        </w:rPr>
-        <w:t>Perspectives</w:t>
-      </w:r>
-      <w:r>
-        <w:rPr>
-          <w:sz w:val="24"/>
-          <w:szCs w:val="24"/>
-        </w:rPr>
-        <w:t xml:space="preserve"> ou encore ce qui reste à faire ou encore les extensions futures</w:t>
-      </w:r>
-    </w:p>
-    <w:p>
-      <w:pPr>
-        <w:rPr>
-          <w:sz w:val="24"/>
-          <w:szCs w:val="24"/>
-        </w:rPr>
-      </w:pPr>
-    </w:p>
-    <w:p>
-      <w:pPr>
-        <w:pStyle w:val="Titre1"/>
-      </w:pPr>
-      <w:bookmarkStart w:id="177" w:name="_Toc207077071"/>
-      <w:bookmarkStart w:id="178" w:name="_Toc211881041"/>
-      <w:r>
-        <w:t>Bibliographie</w:t>
       </w:r>
       <w:bookmarkEnd w:id="177"/>
       <w:bookmarkEnd w:id="178"/>
     </w:p>
     <w:p>
       <w:pPr>
+        <w:rPr>
+          <w:bCs/>
+          <w:sz w:val="24"/>
+          <w:szCs w:val="24"/>
+        </w:rPr>
+      </w:pPr>
+    </w:p>
+    <w:p>
+      <w:pPr>
+        <w:ind w:left="1134"/>
+        <w:rPr>
+          <w:sz w:val="24"/>
+          <w:szCs w:val="24"/>
+        </w:rPr>
+      </w:pPr>
+      <w:r>
+        <w:rPr>
+          <w:sz w:val="24"/>
+          <w:szCs w:val="24"/>
+        </w:rPr>
+        <w:t xml:space="preserve">Principaux apports </w:t>
+      </w:r>
+      <w:r>
+        <w:rPr>
+          <w:sz w:val="24"/>
+          <w:szCs w:val="24"/>
+        </w:rPr>
+        <w:t>de l’étude</w:t>
+      </w:r>
+      <w:r>
+        <w:rPr>
+          <w:sz w:val="24"/>
+          <w:szCs w:val="24"/>
+        </w:rPr>
+        <w:t xml:space="preserve"> pour vous, pour l’entreprise</w:t>
+      </w:r>
+      <w:r>
+        <w:rPr>
+          <w:sz w:val="24"/>
+          <w:szCs w:val="24"/>
+        </w:rPr>
+        <w:t xml:space="preserve"> ou celui qui a défini le sujet</w:t>
+      </w:r>
+      <w:r>
+        <w:rPr>
+          <w:sz w:val="24"/>
+          <w:szCs w:val="24"/>
+        </w:rPr>
+        <w:t>, pour l’école</w:t>
+      </w:r>
+    </w:p>
+    <w:p>
+      <w:pPr>
+        <w:ind w:left="1418" w:hanging="284"/>
+        <w:rPr>
+          <w:sz w:val="24"/>
+          <w:szCs w:val="24"/>
+        </w:rPr>
+      </w:pPr>
+      <w:r>
+        <w:rPr>
+          <w:sz w:val="24"/>
+          <w:szCs w:val="24"/>
+        </w:rPr>
+        <w:t>Précisions sur le travail réalisé</w:t>
+      </w:r>
+      <w:r>
+        <w:rPr>
+          <w:sz w:val="24"/>
+          <w:szCs w:val="24"/>
+        </w:rPr>
+        <w:t> </w:t>
+      </w:r>
+      <w:r>
+        <w:rPr>
+          <w:sz w:val="24"/>
+          <w:szCs w:val="24"/>
+        </w:rPr>
+        <w:t>(</w:t>
+      </w:r>
+      <w:r>
+        <w:rPr>
+          <w:sz w:val="24"/>
+          <w:szCs w:val="24"/>
+        </w:rPr>
+        <w:t xml:space="preserve">état de l’art, installation, étude </w:t>
+      </w:r>
+      <w:r>
+        <w:rPr>
+          <w:sz w:val="24"/>
+          <w:szCs w:val="24"/>
+        </w:rPr>
+        <w:t>ORACLE 23AI ET LES BD VECTORIELS</w:t>
+      </w:r>
+      <w:r>
+        <w:rPr>
+          <w:sz w:val="24"/>
+          <w:szCs w:val="24"/>
+        </w:rPr>
+        <w:t xml:space="preserve">, </w:t>
+      </w:r>
+      <w:r>
+        <w:rPr>
+          <w:sz w:val="24"/>
+          <w:szCs w:val="24"/>
+        </w:rPr>
+        <w:t xml:space="preserve">mise en œuvre du cas d’usage, intégration dans l’environnement </w:t>
+      </w:r>
+      <w:proofErr w:type="spellStart"/>
+      <w:r>
+        <w:rPr>
+          <w:sz w:val="24"/>
+          <w:szCs w:val="24"/>
+        </w:rPr>
+        <w:t>Bigdata</w:t>
+      </w:r>
+      <w:proofErr w:type="spellEnd"/>
+      <w:r>
+        <w:rPr>
+          <w:sz w:val="24"/>
+          <w:szCs w:val="24"/>
+        </w:rPr>
+        <w:t xml:space="preserve">, </w:t>
+      </w:r>
+      <w:r>
+        <w:rPr>
+          <w:sz w:val="24"/>
+          <w:szCs w:val="24"/>
+        </w:rPr>
+        <w:t>...)</w:t>
+      </w:r>
+    </w:p>
+    <w:p>
+      <w:pPr>
+        <w:ind w:left="1134"/>
+        <w:rPr>
+          <w:sz w:val="24"/>
+          <w:szCs w:val="24"/>
+        </w:rPr>
+      </w:pPr>
+      <w:r>
+        <w:rPr>
+          <w:sz w:val="24"/>
+          <w:szCs w:val="24"/>
+        </w:rPr>
+        <w:t>Précisions sur la situation finale d</w:t>
+      </w:r>
+      <w:r>
+        <w:rPr>
+          <w:sz w:val="24"/>
+          <w:szCs w:val="24"/>
+        </w:rPr>
+        <w:t>u travail</w:t>
+      </w:r>
+      <w:r>
+        <w:rPr>
+          <w:sz w:val="24"/>
+          <w:szCs w:val="24"/>
+        </w:rPr>
+        <w:t xml:space="preserve"> réalisée (</w:t>
+      </w:r>
+      <w:r>
+        <w:rPr>
+          <w:sz w:val="24"/>
+          <w:szCs w:val="24"/>
+        </w:rPr>
+        <w:t xml:space="preserve">Le statu des livrables </w:t>
+      </w:r>
+      <w:r>
+        <w:rPr>
+          <w:sz w:val="24"/>
+          <w:szCs w:val="24"/>
+        </w:rPr>
+        <w:t xml:space="preserve">en </w:t>
+      </w:r>
+      <w:r>
+        <w:rPr>
+          <w:sz w:val="24"/>
+          <w:szCs w:val="24"/>
+        </w:rPr>
+        <w:t>production</w:t>
+      </w:r>
+      <w:r>
+        <w:rPr>
+          <w:sz w:val="24"/>
+          <w:szCs w:val="24"/>
+        </w:rPr>
+        <w:t xml:space="preserve">, ..., </w:t>
+      </w:r>
+      <w:r>
+        <w:rPr>
+          <w:sz w:val="24"/>
+          <w:szCs w:val="24"/>
+        </w:rPr>
+        <w:t xml:space="preserve">en </w:t>
+      </w:r>
+      <w:proofErr w:type="gramStart"/>
+      <w:r>
+        <w:rPr>
+          <w:sz w:val="24"/>
+          <w:szCs w:val="24"/>
+        </w:rPr>
+        <w:t>test,  fini</w:t>
+      </w:r>
+      <w:proofErr w:type="gramEnd"/>
+      <w:r>
+        <w:rPr>
+          <w:sz w:val="24"/>
+          <w:szCs w:val="24"/>
+        </w:rPr>
+        <w:t xml:space="preserve"> à X %</w:t>
+      </w:r>
+      <w:r>
+        <w:rPr>
+          <w:sz w:val="24"/>
+          <w:szCs w:val="24"/>
+        </w:rPr>
+        <w:t>)</w:t>
+      </w:r>
+    </w:p>
+    <w:p>
+      <w:pPr>
+        <w:ind w:left="1134"/>
+        <w:rPr>
+          <w:sz w:val="24"/>
+          <w:szCs w:val="24"/>
+        </w:rPr>
+      </w:pPr>
+      <w:r>
+        <w:rPr>
+          <w:sz w:val="24"/>
+          <w:szCs w:val="24"/>
+        </w:rPr>
+        <w:t>Principales difficultés rencontrées</w:t>
+      </w:r>
+      <w:r>
+        <w:rPr>
+          <w:sz w:val="24"/>
+          <w:szCs w:val="24"/>
+        </w:rPr>
+        <w:t xml:space="preserve"> et solutions apportées</w:t>
+      </w:r>
+    </w:p>
+    <w:p>
+      <w:pPr>
+        <w:ind w:left="1134"/>
+        <w:rPr>
+          <w:sz w:val="24"/>
+          <w:szCs w:val="24"/>
+        </w:rPr>
+      </w:pPr>
+      <w:r>
+        <w:rPr>
+          <w:sz w:val="24"/>
+          <w:szCs w:val="24"/>
+        </w:rPr>
+        <w:t>Perspectives</w:t>
+      </w:r>
+      <w:r>
+        <w:rPr>
+          <w:sz w:val="24"/>
+          <w:szCs w:val="24"/>
+        </w:rPr>
+        <w:t xml:space="preserve"> ou encore ce qui reste à faire ou encore les extensions futures</w:t>
+      </w:r>
+    </w:p>
+    <w:p>
+      <w:pPr>
+        <w:rPr>
+          <w:sz w:val="24"/>
+          <w:szCs w:val="24"/>
+        </w:rPr>
+      </w:pPr>
+    </w:p>
+    <w:p>
+      <w:pPr>
+        <w:pStyle w:val="Titre1"/>
+      </w:pPr>
+      <w:bookmarkStart w:id="179" w:name="_Toc207077071"/>
+      <w:bookmarkStart w:id="180" w:name="_Toc211881041"/>
+      <w:r>
+        <w:t>Bibliographie</w:t>
+      </w:r>
+      <w:bookmarkEnd w:id="179"/>
+      <w:bookmarkEnd w:id="180"/>
+    </w:p>
+    <w:p>
+      <w:pPr>
         <w:tabs>
           <w:tab w:val="left" w:pos="1305"/>
         </w:tabs>
@@ -33265,7 +33868,7 @@
           <w:szCs w:val="24"/>
         </w:rPr>
       </w:pPr>
-      <w:bookmarkStart w:id="179" w:name="_Toc211881042"/>
+      <w:bookmarkStart w:id="181" w:name="_Toc211881042"/>
       <w:r>
         <w:rPr>
           <w:rFonts w:ascii="Times New Roman" w:hAnsi="Times New Roman"/>
@@ -33274,7 +33877,7 @@
         </w:rPr>
         <w:t>Chapitre 3 – Concepts fondamentaux des bases de données vectorielles</w:t>
       </w:r>
-      <w:bookmarkEnd w:id="179"/>
+      <w:bookmarkEnd w:id="181"/>
     </w:p>
     <w:p>
       <w:pPr>
@@ -33580,11 +34183,11 @@
           <w:rFonts w:ascii="Times New Roman" w:hAnsi="Times New Roman"/>
         </w:rPr>
       </w:pPr>
-      <w:bookmarkStart w:id="180" w:name="_Toc211881043"/>
+      <w:bookmarkStart w:id="182" w:name="_Toc211881043"/>
       <w:r>
         <w:t>Chapitre 4 – État de l’art et critères comparatifs</w:t>
       </w:r>
-      <w:bookmarkEnd w:id="180"/>
+      <w:bookmarkEnd w:id="182"/>
     </w:p>
     <w:p>
       <w:pPr>
@@ -33593,11 +34196,11 @@
           <w:rFonts w:ascii="Times New Roman" w:hAnsi="Times New Roman"/>
         </w:rPr>
       </w:pPr>
-      <w:bookmarkStart w:id="181" w:name="_Toc211881044"/>
+      <w:bookmarkStart w:id="183" w:name="_Toc211881044"/>
       <w:r>
         <w:t>Fondements théoriques et architecture</w:t>
       </w:r>
-      <w:bookmarkEnd w:id="181"/>
+      <w:bookmarkEnd w:id="183"/>
     </w:p>
     <w:p>
       <w:pPr>
@@ -33684,7 +34287,7 @@
       <w:r>
         <w:t xml:space="preserve">. </w:t>
       </w:r>
-      <w:hyperlink r:id="rId38" w:tgtFrame="_new" w:history="1">
+      <w:hyperlink r:id="rId40" w:tgtFrame="_new" w:history="1">
         <w:r>
           <w:rPr>
             <w:rStyle w:val="Lienhypertexte"/>
@@ -33804,7 +34407,7 @@
         </w:rPr>
         <w:t xml:space="preserve">. </w:t>
       </w:r>
-      <w:hyperlink r:id="rId39" w:tgtFrame="_new" w:history="1">
+      <w:hyperlink r:id="rId41" w:tgtFrame="_new" w:history="1">
         <w:proofErr w:type="spellStart"/>
         <w:proofErr w:type="gramStart"/>
         <w:r>
@@ -34056,7 +34659,7 @@
         </w:rPr>
         <w:t xml:space="preserve">. </w:t>
       </w:r>
-      <w:hyperlink r:id="rId40" w:tgtFrame="_new" w:history="1">
+      <w:hyperlink r:id="rId42" w:tgtFrame="_new" w:history="1">
         <w:r>
           <w:rPr>
             <w:rStyle w:val="Lienhypertexte"/>
@@ -34072,11 +34675,11 @@
           <w:rFonts w:ascii="Times New Roman" w:hAnsi="Times New Roman"/>
         </w:rPr>
       </w:pPr>
-      <w:bookmarkStart w:id="182" w:name="_Toc211881045"/>
+      <w:bookmarkStart w:id="184" w:name="_Toc211881045"/>
       <w:r>
         <w:t>Chapitre 5 – Oracle 23ai et BD vectorielles</w:t>
       </w:r>
-      <w:bookmarkEnd w:id="182"/>
+      <w:bookmarkEnd w:id="184"/>
     </w:p>
     <w:p>
       <w:pPr>
@@ -34324,7 +34927,7 @@
           <w:rFonts w:ascii="Times New Roman" w:hAnsi="Times New Roman"/>
         </w:rPr>
       </w:pPr>
-      <w:bookmarkStart w:id="183" w:name="_Toc211881046"/>
+      <w:bookmarkStart w:id="185" w:name="_Toc211881046"/>
       <w:r>
         <w:t xml:space="preserve">Chapitre 6 – </w:t>
       </w:r>
@@ -34343,7 +34946,7 @@
       <w:r>
         <w:t>lake</w:t>
       </w:r>
-      <w:bookmarkEnd w:id="183"/>
+      <w:bookmarkEnd w:id="185"/>
       <w:proofErr w:type="spellEnd"/>
     </w:p>
     <w:p>
@@ -34507,7 +35110,7 @@
         <w:br/>
         <w:t xml:space="preserve">Disponible sur : </w:t>
       </w:r>
-      <w:hyperlink r:id="rId41" w:tgtFrame="_new" w:history="1">
+      <w:hyperlink r:id="rId43" w:tgtFrame="_new" w:history="1">
         <w:r>
           <w:rPr>
             <w:rStyle w:val="Lienhypertexte"/>
@@ -37358,6 +37961,304 @@
     </w:lvl>
   </w:abstractNum>
   <w:abstractNum w:abstractNumId="15" w15:restartNumberingAfterBreak="0">
+    <w:nsid w:val="17A95420"/>
+    <w:multiLevelType w:val="multilevel"/>
+    <w:tmpl w:val="0ECC1D74"/>
+    <w:lvl w:ilvl="0">
+      <w:start w:val="1"/>
+      <w:numFmt w:val="bullet"/>
+      <w:lvlText w:val=""/>
+      <w:lvlJc w:val="left"/>
+      <w:pPr>
+        <w:tabs>
+          <w:tab w:val="num" w:pos="720"/>
+        </w:tabs>
+        <w:ind w:left="720" w:hanging="360"/>
+      </w:pPr>
+      <w:rPr>
+        <w:rFonts w:ascii="Symbol" w:hAnsi="Symbol" w:hint="default"/>
+        <w:sz w:val="20"/>
+      </w:rPr>
+    </w:lvl>
+    <w:lvl w:ilvl="1">
+      <w:start w:val="1"/>
+      <w:numFmt w:val="bullet"/>
+      <w:lvlText w:val="o"/>
+      <w:lvlJc w:val="left"/>
+      <w:pPr>
+        <w:tabs>
+          <w:tab w:val="num" w:pos="1440"/>
+        </w:tabs>
+        <w:ind w:left="1440" w:hanging="360"/>
+      </w:pPr>
+      <w:rPr>
+        <w:rFonts w:ascii="Courier New" w:hAnsi="Courier New" w:hint="default"/>
+        <w:sz w:val="20"/>
+      </w:rPr>
+    </w:lvl>
+    <w:lvl w:ilvl="2" w:tentative="1">
+      <w:start w:val="1"/>
+      <w:numFmt w:val="bullet"/>
+      <w:lvlText w:val=""/>
+      <w:lvlJc w:val="left"/>
+      <w:pPr>
+        <w:tabs>
+          <w:tab w:val="num" w:pos="2160"/>
+        </w:tabs>
+        <w:ind w:left="2160" w:hanging="360"/>
+      </w:pPr>
+      <w:rPr>
+        <w:rFonts w:ascii="Wingdings" w:hAnsi="Wingdings" w:hint="default"/>
+        <w:sz w:val="20"/>
+      </w:rPr>
+    </w:lvl>
+    <w:lvl w:ilvl="3" w:tentative="1">
+      <w:start w:val="1"/>
+      <w:numFmt w:val="bullet"/>
+      <w:lvlText w:val=""/>
+      <w:lvlJc w:val="left"/>
+      <w:pPr>
+        <w:tabs>
+          <w:tab w:val="num" w:pos="2880"/>
+        </w:tabs>
+        <w:ind w:left="2880" w:hanging="360"/>
+      </w:pPr>
+      <w:rPr>
+        <w:rFonts w:ascii="Wingdings" w:hAnsi="Wingdings" w:hint="default"/>
+        <w:sz w:val="20"/>
+      </w:rPr>
+    </w:lvl>
+    <w:lvl w:ilvl="4" w:tentative="1">
+      <w:start w:val="1"/>
+      <w:numFmt w:val="bullet"/>
+      <w:lvlText w:val=""/>
+      <w:lvlJc w:val="left"/>
+      <w:pPr>
+        <w:tabs>
+          <w:tab w:val="num" w:pos="3600"/>
+        </w:tabs>
+        <w:ind w:left="3600" w:hanging="360"/>
+      </w:pPr>
+      <w:rPr>
+        <w:rFonts w:ascii="Wingdings" w:hAnsi="Wingdings" w:hint="default"/>
+        <w:sz w:val="20"/>
+      </w:rPr>
+    </w:lvl>
+    <w:lvl w:ilvl="5" w:tentative="1">
+      <w:start w:val="1"/>
+      <w:numFmt w:val="bullet"/>
+      <w:lvlText w:val=""/>
+      <w:lvlJc w:val="left"/>
+      <w:pPr>
+        <w:tabs>
+          <w:tab w:val="num" w:pos="4320"/>
+        </w:tabs>
+        <w:ind w:left="4320" w:hanging="360"/>
+      </w:pPr>
+      <w:rPr>
+        <w:rFonts w:ascii="Wingdings" w:hAnsi="Wingdings" w:hint="default"/>
+        <w:sz w:val="20"/>
+      </w:rPr>
+    </w:lvl>
+    <w:lvl w:ilvl="6" w:tentative="1">
+      <w:start w:val="1"/>
+      <w:numFmt w:val="bullet"/>
+      <w:lvlText w:val=""/>
+      <w:lvlJc w:val="left"/>
+      <w:pPr>
+        <w:tabs>
+          <w:tab w:val="num" w:pos="5040"/>
+        </w:tabs>
+        <w:ind w:left="5040" w:hanging="360"/>
+      </w:pPr>
+      <w:rPr>
+        <w:rFonts w:ascii="Wingdings" w:hAnsi="Wingdings" w:hint="default"/>
+        <w:sz w:val="20"/>
+      </w:rPr>
+    </w:lvl>
+    <w:lvl w:ilvl="7" w:tentative="1">
+      <w:start w:val="1"/>
+      <w:numFmt w:val="bullet"/>
+      <w:lvlText w:val=""/>
+      <w:lvlJc w:val="left"/>
+      <w:pPr>
+        <w:tabs>
+          <w:tab w:val="num" w:pos="5760"/>
+        </w:tabs>
+        <w:ind w:left="5760" w:hanging="360"/>
+      </w:pPr>
+      <w:rPr>
+        <w:rFonts w:ascii="Wingdings" w:hAnsi="Wingdings" w:hint="default"/>
+        <w:sz w:val="20"/>
+      </w:rPr>
+    </w:lvl>
+    <w:lvl w:ilvl="8" w:tentative="1">
+      <w:start w:val="1"/>
+      <w:numFmt w:val="bullet"/>
+      <w:lvlText w:val=""/>
+      <w:lvlJc w:val="left"/>
+      <w:pPr>
+        <w:tabs>
+          <w:tab w:val="num" w:pos="6480"/>
+        </w:tabs>
+        <w:ind w:left="6480" w:hanging="360"/>
+      </w:pPr>
+      <w:rPr>
+        <w:rFonts w:ascii="Wingdings" w:hAnsi="Wingdings" w:hint="default"/>
+        <w:sz w:val="20"/>
+      </w:rPr>
+    </w:lvl>
+  </w:abstractNum>
+  <w:abstractNum w:abstractNumId="16" w15:restartNumberingAfterBreak="0">
+    <w:nsid w:val="1A282E24"/>
+    <w:multiLevelType w:val="multilevel"/>
+    <w:tmpl w:val="BE180F9C"/>
+    <w:lvl w:ilvl="0">
+      <w:start w:val="1"/>
+      <w:numFmt w:val="bullet"/>
+      <w:lvlText w:val=""/>
+      <w:lvlJc w:val="left"/>
+      <w:pPr>
+        <w:tabs>
+          <w:tab w:val="num" w:pos="720"/>
+        </w:tabs>
+        <w:ind w:left="720" w:hanging="360"/>
+      </w:pPr>
+      <w:rPr>
+        <w:rFonts w:ascii="Symbol" w:hAnsi="Symbol" w:hint="default"/>
+        <w:sz w:val="20"/>
+      </w:rPr>
+    </w:lvl>
+    <w:lvl w:ilvl="1" w:tentative="1">
+      <w:start w:val="1"/>
+      <w:numFmt w:val="bullet"/>
+      <w:lvlText w:val="o"/>
+      <w:lvlJc w:val="left"/>
+      <w:pPr>
+        <w:tabs>
+          <w:tab w:val="num" w:pos="1440"/>
+        </w:tabs>
+        <w:ind w:left="1440" w:hanging="360"/>
+      </w:pPr>
+      <w:rPr>
+        <w:rFonts w:ascii="Courier New" w:hAnsi="Courier New" w:hint="default"/>
+        <w:sz w:val="20"/>
+      </w:rPr>
+    </w:lvl>
+    <w:lvl w:ilvl="2" w:tentative="1">
+      <w:start w:val="1"/>
+      <w:numFmt w:val="bullet"/>
+      <w:lvlText w:val=""/>
+      <w:lvlJc w:val="left"/>
+      <w:pPr>
+        <w:tabs>
+          <w:tab w:val="num" w:pos="2160"/>
+        </w:tabs>
+        <w:ind w:left="2160" w:hanging="360"/>
+      </w:pPr>
+      <w:rPr>
+        <w:rFonts w:ascii="Wingdings" w:hAnsi="Wingdings" w:hint="default"/>
+        <w:sz w:val="20"/>
+      </w:rPr>
+    </w:lvl>
+    <w:lvl w:ilvl="3" w:tentative="1">
+      <w:start w:val="1"/>
+      <w:numFmt w:val="bullet"/>
+      <w:lvlText w:val=""/>
+      <w:lvlJc w:val="left"/>
+      <w:pPr>
+        <w:tabs>
+          <w:tab w:val="num" w:pos="2880"/>
+        </w:tabs>
+        <w:ind w:left="2880" w:hanging="360"/>
+      </w:pPr>
+      <w:rPr>
+        <w:rFonts w:ascii="Wingdings" w:hAnsi="Wingdings" w:hint="default"/>
+        <w:sz w:val="20"/>
+      </w:rPr>
+    </w:lvl>
+    <w:lvl w:ilvl="4" w:tentative="1">
+      <w:start w:val="1"/>
+      <w:numFmt w:val="bullet"/>
+      <w:lvlText w:val=""/>
+      <w:lvlJc w:val="left"/>
+      <w:pPr>
+        <w:tabs>
+          <w:tab w:val="num" w:pos="3600"/>
+        </w:tabs>
+        <w:ind w:left="3600" w:hanging="360"/>
+      </w:pPr>
+      <w:rPr>
+        <w:rFonts w:ascii="Wingdings" w:hAnsi="Wingdings" w:hint="default"/>
+        <w:sz w:val="20"/>
+      </w:rPr>
+    </w:lvl>
+    <w:lvl w:ilvl="5" w:tentative="1">
+      <w:start w:val="1"/>
+      <w:numFmt w:val="bullet"/>
+      <w:lvlText w:val=""/>
+      <w:lvlJc w:val="left"/>
+      <w:pPr>
+        <w:tabs>
+          <w:tab w:val="num" w:pos="4320"/>
+        </w:tabs>
+        <w:ind w:left="4320" w:hanging="360"/>
+      </w:pPr>
+      <w:rPr>
+        <w:rFonts w:ascii="Wingdings" w:hAnsi="Wingdings" w:hint="default"/>
+        <w:sz w:val="20"/>
+      </w:rPr>
+    </w:lvl>
+    <w:lvl w:ilvl="6" w:tentative="1">
+      <w:start w:val="1"/>
+      <w:numFmt w:val="bullet"/>
+      <w:lvlText w:val=""/>
+      <w:lvlJc w:val="left"/>
+      <w:pPr>
+        <w:tabs>
+          <w:tab w:val="num" w:pos="5040"/>
+        </w:tabs>
+        <w:ind w:left="5040" w:hanging="360"/>
+      </w:pPr>
+      <w:rPr>
+        <w:rFonts w:ascii="Wingdings" w:hAnsi="Wingdings" w:hint="default"/>
+        <w:sz w:val="20"/>
+      </w:rPr>
+    </w:lvl>
+    <w:lvl w:ilvl="7" w:tentative="1">
+      <w:start w:val="1"/>
+      <w:numFmt w:val="bullet"/>
+      <w:lvlText w:val=""/>
+      <w:lvlJc w:val="left"/>
+      <w:pPr>
+        <w:tabs>
+          <w:tab w:val="num" w:pos="5760"/>
+        </w:tabs>
+        <w:ind w:left="5760" w:hanging="360"/>
+      </w:pPr>
+      <w:rPr>
+        <w:rFonts w:ascii="Wingdings" w:hAnsi="Wingdings" w:hint="default"/>
+        <w:sz w:val="20"/>
+      </w:rPr>
+    </w:lvl>
+    <w:lvl w:ilvl="8" w:tentative="1">
+      <w:start w:val="1"/>
+      <w:numFmt w:val="bullet"/>
+      <w:lvlText w:val=""/>
+      <w:lvlJc w:val="left"/>
+      <w:pPr>
+        <w:tabs>
+          <w:tab w:val="num" w:pos="6480"/>
+        </w:tabs>
+        <w:ind w:left="6480" w:hanging="360"/>
+      </w:pPr>
+      <w:rPr>
+        <w:rFonts w:ascii="Wingdings" w:hAnsi="Wingdings" w:hint="default"/>
+        <w:sz w:val="20"/>
+      </w:rPr>
+    </w:lvl>
+  </w:abstractNum>
+  <w:abstractNum w:abstractNumId="17" w15:restartNumberingAfterBreak="0">
     <w:nsid w:val="1A933937"/>
     <w:multiLevelType w:val="multilevel"/>
     <w:tmpl w:val="73DC287E"/>
@@ -37506,7 +38407,7 @@
       </w:rPr>
     </w:lvl>
   </w:abstractNum>
-  <w:abstractNum w:abstractNumId="16" w15:restartNumberingAfterBreak="0">
+  <w:abstractNum w:abstractNumId="18" w15:restartNumberingAfterBreak="0">
     <w:nsid w:val="1A9570B9"/>
     <w:multiLevelType w:val="hybridMultilevel"/>
     <w:tmpl w:val="677EE3B6"/>
@@ -37595,7 +38496,7 @@
       </w:pPr>
     </w:lvl>
   </w:abstractNum>
-  <w:abstractNum w:abstractNumId="17" w15:restartNumberingAfterBreak="0">
+  <w:abstractNum w:abstractNumId="19" w15:restartNumberingAfterBreak="0">
     <w:nsid w:val="1BC22889"/>
     <w:multiLevelType w:val="multilevel"/>
     <w:tmpl w:val="72CEE9D6"/>
@@ -37744,7 +38645,156 @@
       </w:rPr>
     </w:lvl>
   </w:abstractNum>
-  <w:abstractNum w:abstractNumId="18" w15:restartNumberingAfterBreak="0">
+  <w:abstractNum w:abstractNumId="20" w15:restartNumberingAfterBreak="0">
+    <w:nsid w:val="21C00581"/>
+    <w:multiLevelType w:val="multilevel"/>
+    <w:tmpl w:val="AEDCD3E6"/>
+    <w:lvl w:ilvl="0">
+      <w:start w:val="1"/>
+      <w:numFmt w:val="bullet"/>
+      <w:lvlText w:val=""/>
+      <w:lvlJc w:val="left"/>
+      <w:pPr>
+        <w:tabs>
+          <w:tab w:val="num" w:pos="720"/>
+        </w:tabs>
+        <w:ind w:left="720" w:hanging="360"/>
+      </w:pPr>
+      <w:rPr>
+        <w:rFonts w:ascii="Symbol" w:hAnsi="Symbol" w:hint="default"/>
+        <w:sz w:val="20"/>
+      </w:rPr>
+    </w:lvl>
+    <w:lvl w:ilvl="1" w:tentative="1">
+      <w:start w:val="1"/>
+      <w:numFmt w:val="bullet"/>
+      <w:lvlText w:val="o"/>
+      <w:lvlJc w:val="left"/>
+      <w:pPr>
+        <w:tabs>
+          <w:tab w:val="num" w:pos="1440"/>
+        </w:tabs>
+        <w:ind w:left="1440" w:hanging="360"/>
+      </w:pPr>
+      <w:rPr>
+        <w:rFonts w:ascii="Courier New" w:hAnsi="Courier New" w:hint="default"/>
+        <w:sz w:val="20"/>
+      </w:rPr>
+    </w:lvl>
+    <w:lvl w:ilvl="2" w:tentative="1">
+      <w:start w:val="1"/>
+      <w:numFmt w:val="bullet"/>
+      <w:lvlText w:val=""/>
+      <w:lvlJc w:val="left"/>
+      <w:pPr>
+        <w:tabs>
+          <w:tab w:val="num" w:pos="2160"/>
+        </w:tabs>
+        <w:ind w:left="2160" w:hanging="360"/>
+      </w:pPr>
+      <w:rPr>
+        <w:rFonts w:ascii="Wingdings" w:hAnsi="Wingdings" w:hint="default"/>
+        <w:sz w:val="20"/>
+      </w:rPr>
+    </w:lvl>
+    <w:lvl w:ilvl="3" w:tentative="1">
+      <w:start w:val="1"/>
+      <w:numFmt w:val="bullet"/>
+      <w:lvlText w:val=""/>
+      <w:lvlJc w:val="left"/>
+      <w:pPr>
+        <w:tabs>
+          <w:tab w:val="num" w:pos="2880"/>
+        </w:tabs>
+        <w:ind w:left="2880" w:hanging="360"/>
+      </w:pPr>
+      <w:rPr>
+        <w:rFonts w:ascii="Wingdings" w:hAnsi="Wingdings" w:hint="default"/>
+        <w:sz w:val="20"/>
+      </w:rPr>
+    </w:lvl>
+    <w:lvl w:ilvl="4" w:tentative="1">
+      <w:start w:val="1"/>
+      <w:numFmt w:val="bullet"/>
+      <w:lvlText w:val=""/>
+      <w:lvlJc w:val="left"/>
+      <w:pPr>
+        <w:tabs>
+          <w:tab w:val="num" w:pos="3600"/>
+        </w:tabs>
+        <w:ind w:left="3600" w:hanging="360"/>
+      </w:pPr>
+      <w:rPr>
+        <w:rFonts w:ascii="Wingdings" w:hAnsi="Wingdings" w:hint="default"/>
+        <w:sz w:val="20"/>
+      </w:rPr>
+    </w:lvl>
+    <w:lvl w:ilvl="5" w:tentative="1">
+      <w:start w:val="1"/>
+      <w:numFmt w:val="bullet"/>
+      <w:lvlText w:val=""/>
+      <w:lvlJc w:val="left"/>
+      <w:pPr>
+        <w:tabs>
+          <w:tab w:val="num" w:pos="4320"/>
+        </w:tabs>
+        <w:ind w:left="4320" w:hanging="360"/>
+      </w:pPr>
+      <w:rPr>
+        <w:rFonts w:ascii="Wingdings" w:hAnsi="Wingdings" w:hint="default"/>
+        <w:sz w:val="20"/>
+      </w:rPr>
+    </w:lvl>
+    <w:lvl w:ilvl="6" w:tentative="1">
+      <w:start w:val="1"/>
+      <w:numFmt w:val="bullet"/>
+      <w:lvlText w:val=""/>
+      <w:lvlJc w:val="left"/>
+      <w:pPr>
+        <w:tabs>
+          <w:tab w:val="num" w:pos="5040"/>
+        </w:tabs>
+        <w:ind w:left="5040" w:hanging="360"/>
+      </w:pPr>
+      <w:rPr>
+        <w:rFonts w:ascii="Wingdings" w:hAnsi="Wingdings" w:hint="default"/>
+        <w:sz w:val="20"/>
+      </w:rPr>
+    </w:lvl>
+    <w:lvl w:ilvl="7" w:tentative="1">
+      <w:start w:val="1"/>
+      <w:numFmt w:val="bullet"/>
+      <w:lvlText w:val=""/>
+      <w:lvlJc w:val="left"/>
+      <w:pPr>
+        <w:tabs>
+          <w:tab w:val="num" w:pos="5760"/>
+        </w:tabs>
+        <w:ind w:left="5760" w:hanging="360"/>
+      </w:pPr>
+      <w:rPr>
+        <w:rFonts w:ascii="Wingdings" w:hAnsi="Wingdings" w:hint="default"/>
+        <w:sz w:val="20"/>
+      </w:rPr>
+    </w:lvl>
+    <w:lvl w:ilvl="8" w:tentative="1">
+      <w:start w:val="1"/>
+      <w:numFmt w:val="bullet"/>
+      <w:lvlText w:val=""/>
+      <w:lvlJc w:val="left"/>
+      <w:pPr>
+        <w:tabs>
+          <w:tab w:val="num" w:pos="6480"/>
+        </w:tabs>
+        <w:ind w:left="6480" w:hanging="360"/>
+      </w:pPr>
+      <w:rPr>
+        <w:rFonts w:ascii="Wingdings" w:hAnsi="Wingdings" w:hint="default"/>
+        <w:sz w:val="20"/>
+      </w:rPr>
+    </w:lvl>
+  </w:abstractNum>
+  <w:abstractNum w:abstractNumId="21" w15:restartNumberingAfterBreak="0">
     <w:nsid w:val="21C53AAD"/>
     <w:multiLevelType w:val="multilevel"/>
     <w:tmpl w:val="9A367008"/>
@@ -37857,7 +38907,7 @@
       </w:pPr>
     </w:lvl>
   </w:abstractNum>
-  <w:abstractNum w:abstractNumId="19" w15:restartNumberingAfterBreak="0">
+  <w:abstractNum w:abstractNumId="22" w15:restartNumberingAfterBreak="0">
     <w:nsid w:val="232A4401"/>
     <w:multiLevelType w:val="multilevel"/>
     <w:tmpl w:val="5DF4B160"/>
@@ -38006,7 +39056,7 @@
       </w:rPr>
     </w:lvl>
   </w:abstractNum>
-  <w:abstractNum w:abstractNumId="20" w15:restartNumberingAfterBreak="0">
+  <w:abstractNum w:abstractNumId="23" w15:restartNumberingAfterBreak="0">
     <w:nsid w:val="23454768"/>
     <w:multiLevelType w:val="multilevel"/>
     <w:tmpl w:val="6A165DF0"/>
@@ -38155,7 +39205,7 @@
       </w:rPr>
     </w:lvl>
   </w:abstractNum>
-  <w:abstractNum w:abstractNumId="21" w15:restartNumberingAfterBreak="0">
+  <w:abstractNum w:abstractNumId="24" w15:restartNumberingAfterBreak="0">
     <w:nsid w:val="29DF786B"/>
     <w:multiLevelType w:val="hybridMultilevel"/>
     <w:tmpl w:val="F7E49A5A"/>
@@ -38244,7 +39294,7 @@
       </w:pPr>
     </w:lvl>
   </w:abstractNum>
-  <w:abstractNum w:abstractNumId="22" w15:restartNumberingAfterBreak="0">
+  <w:abstractNum w:abstractNumId="25" w15:restartNumberingAfterBreak="0">
     <w:nsid w:val="2A400F9A"/>
     <w:multiLevelType w:val="multilevel"/>
     <w:tmpl w:val="4D92566A"/>
@@ -38393,7 +39443,7 @@
       </w:rPr>
     </w:lvl>
   </w:abstractNum>
-  <w:abstractNum w:abstractNumId="23" w15:restartNumberingAfterBreak="0">
+  <w:abstractNum w:abstractNumId="26" w15:restartNumberingAfterBreak="0">
     <w:nsid w:val="2BC27D9C"/>
     <w:multiLevelType w:val="multilevel"/>
     <w:tmpl w:val="5DFE3CAE"/>
@@ -38542,7 +39592,7 @@
       </w:rPr>
     </w:lvl>
   </w:abstractNum>
-  <w:abstractNum w:abstractNumId="24" w15:restartNumberingAfterBreak="0">
+  <w:abstractNum w:abstractNumId="27" w15:restartNumberingAfterBreak="0">
     <w:nsid w:val="2CB734FB"/>
     <w:multiLevelType w:val="multilevel"/>
     <w:tmpl w:val="86D623E4"/>
@@ -38691,7 +39741,7 @@
       </w:rPr>
     </w:lvl>
   </w:abstractNum>
-  <w:abstractNum w:abstractNumId="25" w15:restartNumberingAfterBreak="0">
+  <w:abstractNum w:abstractNumId="28" w15:restartNumberingAfterBreak="0">
     <w:nsid w:val="2CE75F45"/>
     <w:multiLevelType w:val="hybridMultilevel"/>
     <w:tmpl w:val="BC66096C"/>
@@ -38780,7 +39830,7 @@
       </w:pPr>
     </w:lvl>
   </w:abstractNum>
-  <w:abstractNum w:abstractNumId="26" w15:restartNumberingAfterBreak="0">
+  <w:abstractNum w:abstractNumId="29" w15:restartNumberingAfterBreak="0">
     <w:nsid w:val="2E953BF2"/>
     <w:multiLevelType w:val="multilevel"/>
     <w:tmpl w:val="F92239A0"/>
@@ -38929,7 +39979,7 @@
       </w:rPr>
     </w:lvl>
   </w:abstractNum>
-  <w:abstractNum w:abstractNumId="27" w15:restartNumberingAfterBreak="0">
+  <w:abstractNum w:abstractNumId="30" w15:restartNumberingAfterBreak="0">
     <w:nsid w:val="31914260"/>
     <w:multiLevelType w:val="multilevel"/>
     <w:tmpl w:val="4048600E"/>
@@ -39042,7 +40092,7 @@
       </w:pPr>
     </w:lvl>
   </w:abstractNum>
-  <w:abstractNum w:abstractNumId="28" w15:restartNumberingAfterBreak="0">
+  <w:abstractNum w:abstractNumId="31" w15:restartNumberingAfterBreak="0">
     <w:nsid w:val="331E3753"/>
     <w:multiLevelType w:val="multilevel"/>
     <w:tmpl w:val="3D043D12"/>
@@ -39191,7 +40241,156 @@
       </w:rPr>
     </w:lvl>
   </w:abstractNum>
-  <w:abstractNum w:abstractNumId="29" w15:restartNumberingAfterBreak="0">
+  <w:abstractNum w:abstractNumId="32" w15:restartNumberingAfterBreak="0">
+    <w:nsid w:val="348649B8"/>
+    <w:multiLevelType w:val="multilevel"/>
+    <w:tmpl w:val="AA5E7E8C"/>
+    <w:lvl w:ilvl="0">
+      <w:start w:val="1"/>
+      <w:numFmt w:val="bullet"/>
+      <w:lvlText w:val=""/>
+      <w:lvlJc w:val="left"/>
+      <w:pPr>
+        <w:tabs>
+          <w:tab w:val="num" w:pos="720"/>
+        </w:tabs>
+        <w:ind w:left="720" w:hanging="360"/>
+      </w:pPr>
+      <w:rPr>
+        <w:rFonts w:ascii="Symbol" w:hAnsi="Symbol" w:hint="default"/>
+        <w:sz w:val="20"/>
+      </w:rPr>
+    </w:lvl>
+    <w:lvl w:ilvl="1" w:tentative="1">
+      <w:start w:val="1"/>
+      <w:numFmt w:val="bullet"/>
+      <w:lvlText w:val="o"/>
+      <w:lvlJc w:val="left"/>
+      <w:pPr>
+        <w:tabs>
+          <w:tab w:val="num" w:pos="1440"/>
+        </w:tabs>
+        <w:ind w:left="1440" w:hanging="360"/>
+      </w:pPr>
+      <w:rPr>
+        <w:rFonts w:ascii="Courier New" w:hAnsi="Courier New" w:hint="default"/>
+        <w:sz w:val="20"/>
+      </w:rPr>
+    </w:lvl>
+    <w:lvl w:ilvl="2" w:tentative="1">
+      <w:start w:val="1"/>
+      <w:numFmt w:val="bullet"/>
+      <w:lvlText w:val=""/>
+      <w:lvlJc w:val="left"/>
+      <w:pPr>
+        <w:tabs>
+          <w:tab w:val="num" w:pos="2160"/>
+        </w:tabs>
+        <w:ind w:left="2160" w:hanging="360"/>
+      </w:pPr>
+      <w:rPr>
+        <w:rFonts w:ascii="Wingdings" w:hAnsi="Wingdings" w:hint="default"/>
+        <w:sz w:val="20"/>
+      </w:rPr>
+    </w:lvl>
+    <w:lvl w:ilvl="3" w:tentative="1">
+      <w:start w:val="1"/>
+      <w:numFmt w:val="bullet"/>
+      <w:lvlText w:val=""/>
+      <w:lvlJc w:val="left"/>
+      <w:pPr>
+        <w:tabs>
+          <w:tab w:val="num" w:pos="2880"/>
+        </w:tabs>
+        <w:ind w:left="2880" w:hanging="360"/>
+      </w:pPr>
+      <w:rPr>
+        <w:rFonts w:ascii="Wingdings" w:hAnsi="Wingdings" w:hint="default"/>
+        <w:sz w:val="20"/>
+      </w:rPr>
+    </w:lvl>
+    <w:lvl w:ilvl="4" w:tentative="1">
+      <w:start w:val="1"/>
+      <w:numFmt w:val="bullet"/>
+      <w:lvlText w:val=""/>
+      <w:lvlJc w:val="left"/>
+      <w:pPr>
+        <w:tabs>
+          <w:tab w:val="num" w:pos="3600"/>
+        </w:tabs>
+        <w:ind w:left="3600" w:hanging="360"/>
+      </w:pPr>
+      <w:rPr>
+        <w:rFonts w:ascii="Wingdings" w:hAnsi="Wingdings" w:hint="default"/>
+        <w:sz w:val="20"/>
+      </w:rPr>
+    </w:lvl>
+    <w:lvl w:ilvl="5" w:tentative="1">
+      <w:start w:val="1"/>
+      <w:numFmt w:val="bullet"/>
+      <w:lvlText w:val=""/>
+      <w:lvlJc w:val="left"/>
+      <w:pPr>
+        <w:tabs>
+          <w:tab w:val="num" w:pos="4320"/>
+        </w:tabs>
+        <w:ind w:left="4320" w:hanging="360"/>
+      </w:pPr>
+      <w:rPr>
+        <w:rFonts w:ascii="Wingdings" w:hAnsi="Wingdings" w:hint="default"/>
+        <w:sz w:val="20"/>
+      </w:rPr>
+    </w:lvl>
+    <w:lvl w:ilvl="6" w:tentative="1">
+      <w:start w:val="1"/>
+      <w:numFmt w:val="bullet"/>
+      <w:lvlText w:val=""/>
+      <w:lvlJc w:val="left"/>
+      <w:pPr>
+        <w:tabs>
+          <w:tab w:val="num" w:pos="5040"/>
+        </w:tabs>
+        <w:ind w:left="5040" w:hanging="360"/>
+      </w:pPr>
+      <w:rPr>
+        <w:rFonts w:ascii="Wingdings" w:hAnsi="Wingdings" w:hint="default"/>
+        <w:sz w:val="20"/>
+      </w:rPr>
+    </w:lvl>
+    <w:lvl w:ilvl="7" w:tentative="1">
+      <w:start w:val="1"/>
+      <w:numFmt w:val="bullet"/>
+      <w:lvlText w:val=""/>
+      <w:lvlJc w:val="left"/>
+      <w:pPr>
+        <w:tabs>
+          <w:tab w:val="num" w:pos="5760"/>
+        </w:tabs>
+        <w:ind w:left="5760" w:hanging="360"/>
+      </w:pPr>
+      <w:rPr>
+        <w:rFonts w:ascii="Wingdings" w:hAnsi="Wingdings" w:hint="default"/>
+        <w:sz w:val="20"/>
+      </w:rPr>
+    </w:lvl>
+    <w:lvl w:ilvl="8" w:tentative="1">
+      <w:start w:val="1"/>
+      <w:numFmt w:val="bullet"/>
+      <w:lvlText w:val=""/>
+      <w:lvlJc w:val="left"/>
+      <w:pPr>
+        <w:tabs>
+          <w:tab w:val="num" w:pos="6480"/>
+        </w:tabs>
+        <w:ind w:left="6480" w:hanging="360"/>
+      </w:pPr>
+      <w:rPr>
+        <w:rFonts w:ascii="Wingdings" w:hAnsi="Wingdings" w:hint="default"/>
+        <w:sz w:val="20"/>
+      </w:rPr>
+    </w:lvl>
+  </w:abstractNum>
+  <w:abstractNum w:abstractNumId="33" w15:restartNumberingAfterBreak="0">
     <w:nsid w:val="34AB4479"/>
     <w:multiLevelType w:val="multilevel"/>
     <w:tmpl w:val="3B12AA82"/>
@@ -39340,7 +40539,7 @@
       </w:rPr>
     </w:lvl>
   </w:abstractNum>
-  <w:abstractNum w:abstractNumId="30" w15:restartNumberingAfterBreak="0">
+  <w:abstractNum w:abstractNumId="34" w15:restartNumberingAfterBreak="0">
     <w:nsid w:val="359E2645"/>
     <w:multiLevelType w:val="multilevel"/>
     <w:tmpl w:val="C46E6758"/>
@@ -39453,7 +40652,7 @@
       </w:pPr>
     </w:lvl>
   </w:abstractNum>
-  <w:abstractNum w:abstractNumId="31" w15:restartNumberingAfterBreak="0">
+  <w:abstractNum w:abstractNumId="35" w15:restartNumberingAfterBreak="0">
     <w:nsid w:val="384E3D35"/>
     <w:multiLevelType w:val="multilevel"/>
     <w:tmpl w:val="C93EDE38"/>
@@ -39602,7 +40801,7 @@
       </w:rPr>
     </w:lvl>
   </w:abstractNum>
-  <w:abstractNum w:abstractNumId="32" w15:restartNumberingAfterBreak="0">
+  <w:abstractNum w:abstractNumId="36" w15:restartNumberingAfterBreak="0">
     <w:nsid w:val="39396D32"/>
     <w:multiLevelType w:val="hybridMultilevel"/>
     <w:tmpl w:val="4E6E4406"/>
@@ -39691,7 +40890,7 @@
       </w:pPr>
     </w:lvl>
   </w:abstractNum>
-  <w:abstractNum w:abstractNumId="33" w15:restartNumberingAfterBreak="0">
+  <w:abstractNum w:abstractNumId="37" w15:restartNumberingAfterBreak="0">
     <w:nsid w:val="3B2D608A"/>
     <w:multiLevelType w:val="multilevel"/>
     <w:tmpl w:val="D876AF12"/>
@@ -39804,7 +41003,7 @@
       </w:rPr>
     </w:lvl>
   </w:abstractNum>
-  <w:abstractNum w:abstractNumId="34" w15:restartNumberingAfterBreak="0">
+  <w:abstractNum w:abstractNumId="38" w15:restartNumberingAfterBreak="0">
     <w:nsid w:val="3C9C7ACD"/>
     <w:multiLevelType w:val="multilevel"/>
     <w:tmpl w:val="CCB24826"/>
@@ -39917,7 +41116,7 @@
       </w:pPr>
     </w:lvl>
   </w:abstractNum>
-  <w:abstractNum w:abstractNumId="35" w15:restartNumberingAfterBreak="0">
+  <w:abstractNum w:abstractNumId="39" w15:restartNumberingAfterBreak="0">
     <w:nsid w:val="3DF22774"/>
     <w:multiLevelType w:val="multilevel"/>
     <w:tmpl w:val="7A6CF43C"/>
@@ -40066,7 +41265,7 @@
       </w:rPr>
     </w:lvl>
   </w:abstractNum>
-  <w:abstractNum w:abstractNumId="36" w15:restartNumberingAfterBreak="0">
+  <w:abstractNum w:abstractNumId="40" w15:restartNumberingAfterBreak="0">
     <w:nsid w:val="3EB27452"/>
     <w:multiLevelType w:val="multilevel"/>
     <w:tmpl w:val="040C0021"/>
@@ -40179,7 +41378,7 @@
       </w:rPr>
     </w:lvl>
   </w:abstractNum>
-  <w:abstractNum w:abstractNumId="37" w15:restartNumberingAfterBreak="0">
+  <w:abstractNum w:abstractNumId="41" w15:restartNumberingAfterBreak="0">
     <w:nsid w:val="402632ED"/>
     <w:multiLevelType w:val="multilevel"/>
     <w:tmpl w:val="C8DAD258"/>
@@ -40328,7 +41527,7 @@
       </w:rPr>
     </w:lvl>
   </w:abstractNum>
-  <w:abstractNum w:abstractNumId="38" w15:restartNumberingAfterBreak="0">
+  <w:abstractNum w:abstractNumId="42" w15:restartNumberingAfterBreak="0">
     <w:nsid w:val="420B6C3B"/>
     <w:multiLevelType w:val="multilevel"/>
     <w:tmpl w:val="C8DAD258"/>
@@ -40477,7 +41676,7 @@
       </w:rPr>
     </w:lvl>
   </w:abstractNum>
-  <w:abstractNum w:abstractNumId="39" w15:restartNumberingAfterBreak="0">
+  <w:abstractNum w:abstractNumId="43" w15:restartNumberingAfterBreak="0">
     <w:nsid w:val="427E1F67"/>
     <w:multiLevelType w:val="multilevel"/>
     <w:tmpl w:val="F74CC960"/>
@@ -40626,7 +41825,7 @@
       </w:rPr>
     </w:lvl>
   </w:abstractNum>
-  <w:abstractNum w:abstractNumId="40" w15:restartNumberingAfterBreak="0">
+  <w:abstractNum w:abstractNumId="44" w15:restartNumberingAfterBreak="0">
     <w:nsid w:val="4AC65D17"/>
     <w:multiLevelType w:val="multilevel"/>
     <w:tmpl w:val="C8DAD258"/>
@@ -40775,7 +41974,7 @@
       </w:rPr>
     </w:lvl>
   </w:abstractNum>
-  <w:abstractNum w:abstractNumId="41" w15:restartNumberingAfterBreak="0">
+  <w:abstractNum w:abstractNumId="45" w15:restartNumberingAfterBreak="0">
     <w:nsid w:val="4B1A6F0B"/>
     <w:multiLevelType w:val="multilevel"/>
     <w:tmpl w:val="8528B212"/>
@@ -40924,7 +42123,7 @@
       </w:rPr>
     </w:lvl>
   </w:abstractNum>
-  <w:abstractNum w:abstractNumId="42" w15:restartNumberingAfterBreak="0">
+  <w:abstractNum w:abstractNumId="46" w15:restartNumberingAfterBreak="0">
     <w:nsid w:val="4C9B152A"/>
     <w:multiLevelType w:val="multilevel"/>
     <w:tmpl w:val="C8DAD258"/>
@@ -41073,7 +42272,7 @@
       </w:rPr>
     </w:lvl>
   </w:abstractNum>
-  <w:abstractNum w:abstractNumId="43" w15:restartNumberingAfterBreak="0">
+  <w:abstractNum w:abstractNumId="47" w15:restartNumberingAfterBreak="0">
     <w:nsid w:val="4EDE678F"/>
     <w:multiLevelType w:val="multilevel"/>
     <w:tmpl w:val="57BC49BC"/>
@@ -41222,7 +42421,7 @@
       </w:rPr>
     </w:lvl>
   </w:abstractNum>
-  <w:abstractNum w:abstractNumId="44" w15:restartNumberingAfterBreak="0">
+  <w:abstractNum w:abstractNumId="48" w15:restartNumberingAfterBreak="0">
     <w:nsid w:val="51381C97"/>
     <w:multiLevelType w:val="multilevel"/>
     <w:tmpl w:val="24B6A33A"/>
@@ -41371,7 +42570,7 @@
       </w:rPr>
     </w:lvl>
   </w:abstractNum>
-  <w:abstractNum w:abstractNumId="45" w15:restartNumberingAfterBreak="0">
+  <w:abstractNum w:abstractNumId="49" w15:restartNumberingAfterBreak="0">
     <w:nsid w:val="51393901"/>
     <w:multiLevelType w:val="multilevel"/>
     <w:tmpl w:val="4756393E"/>
@@ -41484,7 +42683,7 @@
       </w:pPr>
     </w:lvl>
   </w:abstractNum>
-  <w:abstractNum w:abstractNumId="46" w15:restartNumberingAfterBreak="0">
+  <w:abstractNum w:abstractNumId="50" w15:restartNumberingAfterBreak="0">
     <w:nsid w:val="51DD6196"/>
     <w:multiLevelType w:val="multilevel"/>
     <w:tmpl w:val="EE12EA90"/>
@@ -41597,7 +42796,7 @@
       </w:pPr>
     </w:lvl>
   </w:abstractNum>
-  <w:abstractNum w:abstractNumId="47" w15:restartNumberingAfterBreak="0">
+  <w:abstractNum w:abstractNumId="51" w15:restartNumberingAfterBreak="0">
     <w:nsid w:val="54185109"/>
     <w:multiLevelType w:val="multilevel"/>
     <w:tmpl w:val="13FE3A6C"/>
@@ -41746,7 +42945,7 @@
       </w:rPr>
     </w:lvl>
   </w:abstractNum>
-  <w:abstractNum w:abstractNumId="48" w15:restartNumberingAfterBreak="0">
+  <w:abstractNum w:abstractNumId="52" w15:restartNumberingAfterBreak="0">
     <w:nsid w:val="5476084E"/>
     <w:multiLevelType w:val="multilevel"/>
     <w:tmpl w:val="C8DAD258"/>
@@ -41895,7 +43094,7 @@
       </w:rPr>
     </w:lvl>
   </w:abstractNum>
-  <w:abstractNum w:abstractNumId="49" w15:restartNumberingAfterBreak="0">
+  <w:abstractNum w:abstractNumId="53" w15:restartNumberingAfterBreak="0">
     <w:nsid w:val="54FC2242"/>
     <w:multiLevelType w:val="multilevel"/>
     <w:tmpl w:val="123AB67E"/>
@@ -42044,7 +43243,7 @@
       </w:rPr>
     </w:lvl>
   </w:abstractNum>
-  <w:abstractNum w:abstractNumId="50" w15:restartNumberingAfterBreak="0">
+  <w:abstractNum w:abstractNumId="54" w15:restartNumberingAfterBreak="0">
     <w:nsid w:val="59972CE2"/>
     <w:multiLevelType w:val="multilevel"/>
     <w:tmpl w:val="48AA0108"/>
@@ -42193,7 +43392,7 @@
       </w:rPr>
     </w:lvl>
   </w:abstractNum>
-  <w:abstractNum w:abstractNumId="51" w15:restartNumberingAfterBreak="0">
+  <w:abstractNum w:abstractNumId="55" w15:restartNumberingAfterBreak="0">
     <w:nsid w:val="5B3A7681"/>
     <w:multiLevelType w:val="multilevel"/>
     <w:tmpl w:val="0178BCA8"/>
@@ -42342,7 +43541,7 @@
       </w:rPr>
     </w:lvl>
   </w:abstractNum>
-  <w:abstractNum w:abstractNumId="52" w15:restartNumberingAfterBreak="0">
+  <w:abstractNum w:abstractNumId="56" w15:restartNumberingAfterBreak="0">
     <w:nsid w:val="5B56423F"/>
     <w:multiLevelType w:val="multilevel"/>
     <w:tmpl w:val="EA94F788"/>
@@ -42464,7 +43663,7 @@
       </w:rPr>
     </w:lvl>
   </w:abstractNum>
-  <w:abstractNum w:abstractNumId="53" w15:restartNumberingAfterBreak="0">
+  <w:abstractNum w:abstractNumId="57" w15:restartNumberingAfterBreak="0">
     <w:nsid w:val="5C0754B2"/>
     <w:multiLevelType w:val="multilevel"/>
     <w:tmpl w:val="10B40500"/>
@@ -42613,7 +43812,7 @@
       </w:rPr>
     </w:lvl>
   </w:abstractNum>
-  <w:abstractNum w:abstractNumId="54" w15:restartNumberingAfterBreak="0">
+  <w:abstractNum w:abstractNumId="58" w15:restartNumberingAfterBreak="0">
     <w:nsid w:val="5D57202A"/>
     <w:multiLevelType w:val="multilevel"/>
     <w:tmpl w:val="2C5E9732"/>
@@ -42762,7 +43961,7 @@
       </w:rPr>
     </w:lvl>
   </w:abstractNum>
-  <w:abstractNum w:abstractNumId="55" w15:restartNumberingAfterBreak="0">
+  <w:abstractNum w:abstractNumId="59" w15:restartNumberingAfterBreak="0">
     <w:nsid w:val="5D8D2CDE"/>
     <w:multiLevelType w:val="hybridMultilevel"/>
     <w:tmpl w:val="712407A6"/>
@@ -42875,7 +44074,7 @@
       </w:rPr>
     </w:lvl>
   </w:abstractNum>
-  <w:abstractNum w:abstractNumId="56" w15:restartNumberingAfterBreak="0">
+  <w:abstractNum w:abstractNumId="60" w15:restartNumberingAfterBreak="0">
     <w:nsid w:val="5EEB1C6D"/>
     <w:multiLevelType w:val="multilevel"/>
     <w:tmpl w:val="006A38EC"/>
@@ -42992,7 +44191,7 @@
       </w:rPr>
     </w:lvl>
   </w:abstractNum>
-  <w:abstractNum w:abstractNumId="57" w15:restartNumberingAfterBreak="0">
+  <w:abstractNum w:abstractNumId="61" w15:restartNumberingAfterBreak="0">
     <w:nsid w:val="5F5F7AAC"/>
     <w:multiLevelType w:val="multilevel"/>
     <w:tmpl w:val="C09EE9D6"/>
@@ -43141,7 +44340,7 @@
       </w:rPr>
     </w:lvl>
   </w:abstractNum>
-  <w:abstractNum w:abstractNumId="58" w15:restartNumberingAfterBreak="0">
+  <w:abstractNum w:abstractNumId="62" w15:restartNumberingAfterBreak="0">
     <w:nsid w:val="5FC37D95"/>
     <w:multiLevelType w:val="hybridMultilevel"/>
     <w:tmpl w:val="5FCED50C"/>
@@ -43230,7 +44429,7 @@
       </w:pPr>
     </w:lvl>
   </w:abstractNum>
-  <w:abstractNum w:abstractNumId="59" w15:restartNumberingAfterBreak="0">
+  <w:abstractNum w:abstractNumId="63" w15:restartNumberingAfterBreak="0">
     <w:nsid w:val="60EE666A"/>
     <w:multiLevelType w:val="hybridMultilevel"/>
     <w:tmpl w:val="139A7318"/>
@@ -43343,7 +44542,7 @@
       </w:rPr>
     </w:lvl>
   </w:abstractNum>
-  <w:abstractNum w:abstractNumId="60" w15:restartNumberingAfterBreak="0">
+  <w:abstractNum w:abstractNumId="64" w15:restartNumberingAfterBreak="0">
     <w:nsid w:val="69442E3E"/>
     <w:multiLevelType w:val="multilevel"/>
     <w:tmpl w:val="7916D600"/>
@@ -43492,7 +44691,7 @@
       </w:rPr>
     </w:lvl>
   </w:abstractNum>
-  <w:abstractNum w:abstractNumId="61" w15:restartNumberingAfterBreak="0">
+  <w:abstractNum w:abstractNumId="65" w15:restartNumberingAfterBreak="0">
     <w:nsid w:val="6BEA45FA"/>
     <w:multiLevelType w:val="multilevel"/>
     <w:tmpl w:val="7C24E6A4"/>
@@ -43605,7 +44804,7 @@
       </w:rPr>
     </w:lvl>
   </w:abstractNum>
-  <w:abstractNum w:abstractNumId="62" w15:restartNumberingAfterBreak="0">
+  <w:abstractNum w:abstractNumId="66" w15:restartNumberingAfterBreak="0">
     <w:nsid w:val="703D17A1"/>
     <w:multiLevelType w:val="multilevel"/>
     <w:tmpl w:val="C8DAD258"/>
@@ -43754,7 +44953,7 @@
       </w:rPr>
     </w:lvl>
   </w:abstractNum>
-  <w:abstractNum w:abstractNumId="63" w15:restartNumberingAfterBreak="0">
+  <w:abstractNum w:abstractNumId="67" w15:restartNumberingAfterBreak="0">
     <w:nsid w:val="711F0137"/>
     <w:multiLevelType w:val="multilevel"/>
     <w:tmpl w:val="768A0B4C"/>
@@ -43903,7 +45102,7 @@
       </w:rPr>
     </w:lvl>
   </w:abstractNum>
-  <w:abstractNum w:abstractNumId="64" w15:restartNumberingAfterBreak="0">
+  <w:abstractNum w:abstractNumId="68" w15:restartNumberingAfterBreak="0">
     <w:nsid w:val="7131356A"/>
     <w:multiLevelType w:val="multilevel"/>
     <w:tmpl w:val="040C0025"/>
@@ -44017,7 +45216,7 @@
       </w:rPr>
     </w:lvl>
   </w:abstractNum>
-  <w:abstractNum w:abstractNumId="65" w15:restartNumberingAfterBreak="0">
+  <w:abstractNum w:abstractNumId="69" w15:restartNumberingAfterBreak="0">
     <w:nsid w:val="72DE74B0"/>
     <w:multiLevelType w:val="multilevel"/>
     <w:tmpl w:val="C8DAD258"/>
@@ -44166,7 +45365,7 @@
       </w:rPr>
     </w:lvl>
   </w:abstractNum>
-  <w:abstractNum w:abstractNumId="66" w15:restartNumberingAfterBreak="0">
+  <w:abstractNum w:abstractNumId="70" w15:restartNumberingAfterBreak="0">
     <w:nsid w:val="7336411D"/>
     <w:multiLevelType w:val="multilevel"/>
     <w:tmpl w:val="93EC73D8"/>
@@ -44315,7 +45514,7 @@
       </w:rPr>
     </w:lvl>
   </w:abstractNum>
-  <w:abstractNum w:abstractNumId="67" w15:restartNumberingAfterBreak="0">
+  <w:abstractNum w:abstractNumId="71" w15:restartNumberingAfterBreak="0">
     <w:nsid w:val="74924F05"/>
     <w:multiLevelType w:val="hybridMultilevel"/>
     <w:tmpl w:val="F02A03F6"/>
@@ -44428,7 +45627,7 @@
       </w:rPr>
     </w:lvl>
   </w:abstractNum>
-  <w:abstractNum w:abstractNumId="68" w15:restartNumberingAfterBreak="0">
+  <w:abstractNum w:abstractNumId="72" w15:restartNumberingAfterBreak="0">
     <w:nsid w:val="762E01AF"/>
     <w:multiLevelType w:val="multilevel"/>
     <w:tmpl w:val="902C8F3C"/>
@@ -44577,7 +45776,7 @@
       </w:rPr>
     </w:lvl>
   </w:abstractNum>
-  <w:abstractNum w:abstractNumId="69" w15:restartNumberingAfterBreak="0">
+  <w:abstractNum w:abstractNumId="73" w15:restartNumberingAfterBreak="0">
     <w:nsid w:val="771126ED"/>
     <w:multiLevelType w:val="multilevel"/>
     <w:tmpl w:val="2280E79A"/>
@@ -44726,7 +45925,7 @@
       </w:rPr>
     </w:lvl>
   </w:abstractNum>
-  <w:abstractNum w:abstractNumId="70" w15:restartNumberingAfterBreak="0">
+  <w:abstractNum w:abstractNumId="74" w15:restartNumberingAfterBreak="0">
     <w:nsid w:val="777526B0"/>
     <w:multiLevelType w:val="hybridMultilevel"/>
     <w:tmpl w:val="0FC09F92"/>
@@ -44815,7 +46014,7 @@
       </w:pPr>
     </w:lvl>
   </w:abstractNum>
-  <w:abstractNum w:abstractNumId="71" w15:restartNumberingAfterBreak="0">
+  <w:abstractNum w:abstractNumId="75" w15:restartNumberingAfterBreak="0">
     <w:nsid w:val="7AAF6D36"/>
     <w:multiLevelType w:val="multilevel"/>
     <w:tmpl w:val="E9923158"/>
@@ -44964,7 +46163,7 @@
       </w:rPr>
     </w:lvl>
   </w:abstractNum>
-  <w:abstractNum w:abstractNumId="72" w15:restartNumberingAfterBreak="0">
+  <w:abstractNum w:abstractNumId="76" w15:restartNumberingAfterBreak="0">
     <w:nsid w:val="7E2939B5"/>
     <w:multiLevelType w:val="multilevel"/>
     <w:tmpl w:val="377E23EC"/>
@@ -45117,55 +46316,55 @@
     <w:abstractNumId w:val="0"/>
   </w:num>
   <w:num w:numId="2">
-    <w:abstractNumId w:val="64"/>
+    <w:abstractNumId w:val="68"/>
   </w:num>
   <w:num w:numId="3">
-    <w:abstractNumId w:val="56"/>
+    <w:abstractNumId w:val="60"/>
   </w:num>
   <w:num w:numId="4">
-    <w:abstractNumId w:val="58"/>
+    <w:abstractNumId w:val="62"/>
   </w:num>
   <w:num w:numId="5">
-    <w:abstractNumId w:val="33"/>
+    <w:abstractNumId w:val="37"/>
   </w:num>
   <w:num w:numId="6">
-    <w:abstractNumId w:val="61"/>
+    <w:abstractNumId w:val="65"/>
   </w:num>
   <w:num w:numId="7">
-    <w:abstractNumId w:val="25"/>
+    <w:abstractNumId w:val="28"/>
   </w:num>
   <w:num w:numId="8">
-    <w:abstractNumId w:val="47"/>
+    <w:abstractNumId w:val="51"/>
   </w:num>
   <w:num w:numId="9">
-    <w:abstractNumId w:val="50"/>
+    <w:abstractNumId w:val="54"/>
   </w:num>
   <w:num w:numId="10">
     <w:abstractNumId w:val="3"/>
   </w:num>
   <w:num w:numId="11">
+    <w:abstractNumId w:val="76"/>
+  </w:num>
+  <w:num w:numId="12">
+    <w:abstractNumId w:val="43"/>
+  </w:num>
+  <w:num w:numId="13">
     <w:abstractNumId w:val="72"/>
   </w:num>
-  <w:num w:numId="12">
-    <w:abstractNumId w:val="39"/>
-  </w:num>
-  <w:num w:numId="13">
-    <w:abstractNumId w:val="68"/>
-  </w:num>
   <w:num w:numId="14">
-    <w:abstractNumId w:val="22"/>
+    <w:abstractNumId w:val="25"/>
   </w:num>
   <w:num w:numId="15">
-    <w:abstractNumId w:val="49"/>
+    <w:abstractNumId w:val="53"/>
   </w:num>
   <w:num w:numId="16">
-    <w:abstractNumId w:val="51"/>
+    <w:abstractNumId w:val="55"/>
   </w:num>
   <w:num w:numId="17">
     <w:abstractNumId w:val="9"/>
   </w:num>
   <w:num w:numId="18">
-    <w:abstractNumId w:val="30"/>
+    <w:abstractNumId w:val="34"/>
   </w:num>
   <w:num w:numId="19">
     <w:abstractNumId w:val="11"/>
@@ -45174,19 +46373,19 @@
     <w:abstractNumId w:val="13"/>
   </w:num>
   <w:num w:numId="21">
-    <w:abstractNumId w:val="21"/>
+    <w:abstractNumId w:val="24"/>
   </w:num>
   <w:num w:numId="22">
     <w:abstractNumId w:val="2"/>
   </w:num>
   <w:num w:numId="23">
+    <w:abstractNumId w:val="63"/>
+  </w:num>
+  <w:num w:numId="24">
     <w:abstractNumId w:val="59"/>
   </w:num>
-  <w:num w:numId="24">
-    <w:abstractNumId w:val="55"/>
-  </w:num>
   <w:num w:numId="25">
-    <w:abstractNumId w:val="41"/>
+    <w:abstractNumId w:val="45"/>
   </w:num>
   <w:num w:numId="26">
     <w:abstractNumId w:val="4"/>
@@ -45195,64 +46394,64 @@
     <w:abstractNumId w:val="12"/>
   </w:num>
   <w:num w:numId="28">
-    <w:abstractNumId w:val="52"/>
+    <w:abstractNumId w:val="56"/>
   </w:num>
   <w:num w:numId="29">
-    <w:abstractNumId w:val="32"/>
+    <w:abstractNumId w:val="36"/>
   </w:num>
   <w:num w:numId="30">
-    <w:abstractNumId w:val="16"/>
+    <w:abstractNumId w:val="18"/>
   </w:num>
   <w:num w:numId="31">
-    <w:abstractNumId w:val="44"/>
+    <w:abstractNumId w:val="48"/>
   </w:num>
   <w:num w:numId="32">
-    <w:abstractNumId w:val="46"/>
+    <w:abstractNumId w:val="50"/>
   </w:num>
   <w:num w:numId="33">
-    <w:abstractNumId w:val="20"/>
+    <w:abstractNumId w:val="23"/>
   </w:num>
   <w:num w:numId="34">
-    <w:abstractNumId w:val="34"/>
+    <w:abstractNumId w:val="38"/>
   </w:num>
   <w:num w:numId="35">
-    <w:abstractNumId w:val="18"/>
+    <w:abstractNumId w:val="21"/>
   </w:num>
   <w:num w:numId="36">
-    <w:abstractNumId w:val="66"/>
+    <w:abstractNumId w:val="70"/>
   </w:num>
   <w:num w:numId="37">
+    <w:abstractNumId w:val="71"/>
+  </w:num>
+  <w:num w:numId="38">
+    <w:abstractNumId w:val="61"/>
+  </w:num>
+  <w:num w:numId="39">
+    <w:abstractNumId w:val="35"/>
+  </w:num>
+  <w:num w:numId="40">
     <w:abstractNumId w:val="67"/>
   </w:num>
-  <w:num w:numId="38">
-    <w:abstractNumId w:val="57"/>
-  </w:num>
-  <w:num w:numId="39">
-    <w:abstractNumId w:val="31"/>
-  </w:num>
-  <w:num w:numId="40">
-    <w:abstractNumId w:val="63"/>
-  </w:num>
   <w:num w:numId="41">
-    <w:abstractNumId w:val="69"/>
+    <w:abstractNumId w:val="73"/>
   </w:num>
   <w:num w:numId="42">
     <w:abstractNumId w:val="7"/>
   </w:num>
   <w:num w:numId="43">
-    <w:abstractNumId w:val="26"/>
+    <w:abstractNumId w:val="29"/>
   </w:num>
   <w:num w:numId="44">
     <w:abstractNumId w:val="1"/>
   </w:num>
   <w:num w:numId="45">
-    <w:abstractNumId w:val="19"/>
+    <w:abstractNumId w:val="22"/>
   </w:num>
   <w:num w:numId="46">
-    <w:abstractNumId w:val="29"/>
+    <w:abstractNumId w:val="33"/>
   </w:num>
   <w:num w:numId="47">
-    <w:abstractNumId w:val="43"/>
+    <w:abstractNumId w:val="47"/>
   </w:num>
   <w:num w:numId="48">
     <w:abstractNumId w:val="5"/>
@@ -45261,91 +46460,94 @@
     <w:abstractNumId w:val="8"/>
   </w:num>
   <w:num w:numId="50">
-    <w:abstractNumId w:val="24"/>
+    <w:abstractNumId w:val="27"/>
   </w:num>
   <w:num w:numId="51">
     <w:abstractNumId w:val="6"/>
   </w:num>
   <w:num w:numId="52">
-    <w:abstractNumId w:val="54"/>
+    <w:abstractNumId w:val="58"/>
   </w:num>
   <w:num w:numId="53">
-    <w:abstractNumId w:val="71"/>
+    <w:abstractNumId w:val="75"/>
   </w:num>
   <w:num w:numId="54">
+    <w:abstractNumId w:val="19"/>
+  </w:num>
+  <w:num w:numId="55">
+    <w:abstractNumId w:val="31"/>
+  </w:num>
+  <w:num w:numId="56">
     <w:abstractNumId w:val="17"/>
   </w:num>
-  <w:num w:numId="55">
-    <w:abstractNumId w:val="28"/>
-  </w:num>
-  <w:num w:numId="56">
-    <w:abstractNumId w:val="15"/>
-  </w:num>
   <w:num w:numId="57">
-    <w:abstractNumId w:val="53"/>
+    <w:abstractNumId w:val="57"/>
   </w:num>
   <w:num w:numId="58">
-    <w:abstractNumId w:val="35"/>
+    <w:abstractNumId w:val="39"/>
   </w:num>
   <w:num w:numId="59">
-    <w:abstractNumId w:val="60"/>
+    <w:abstractNumId w:val="64"/>
   </w:num>
   <w:num w:numId="60">
-    <w:abstractNumId w:val="27"/>
+    <w:abstractNumId w:val="30"/>
   </w:num>
   <w:num w:numId="61">
-    <w:abstractNumId w:val="23"/>
+    <w:abstractNumId w:val="26"/>
   </w:num>
   <w:num w:numId="62">
-    <w:abstractNumId w:val="36"/>
+    <w:abstractNumId w:val="40"/>
   </w:num>
   <w:num w:numId="63">
-    <w:abstractNumId w:val="42"/>
+    <w:abstractNumId w:val="46"/>
   </w:num>
   <w:num w:numId="64">
     <w:abstractNumId w:val="14"/>
   </w:num>
   <w:num w:numId="65">
-    <w:abstractNumId w:val="45"/>
+    <w:abstractNumId w:val="49"/>
   </w:num>
   <w:num w:numId="66">
-    <w:abstractNumId w:val="37"/>
+    <w:abstractNumId w:val="41"/>
   </w:num>
   <w:num w:numId="67">
-    <w:abstractNumId w:val="62"/>
+    <w:abstractNumId w:val="66"/>
   </w:num>
   <w:num w:numId="68">
-    <w:abstractNumId w:val="38"/>
+    <w:abstractNumId w:val="42"/>
   </w:num>
   <w:num w:numId="69">
-    <w:abstractNumId w:val="48"/>
+    <w:abstractNumId w:val="52"/>
   </w:num>
   <w:num w:numId="70">
-    <w:abstractNumId w:val="40"/>
+    <w:abstractNumId w:val="44"/>
   </w:num>
   <w:num w:numId="71">
     <w:abstractNumId w:val="10"/>
   </w:num>
   <w:num w:numId="72">
-    <w:abstractNumId w:val="65"/>
+    <w:abstractNumId w:val="69"/>
   </w:num>
   <w:num w:numId="73">
-    <w:abstractNumId w:val="70"/>
+    <w:abstractNumId w:val="74"/>
   </w:num>
   <w:num w:numId="74">
-    <w:abstractNumId w:val="52"/>
+    <w:abstractNumId w:val="56"/>
   </w:num>
   <w:num w:numId="75">
-    <w:abstractNumId w:val="52"/>
-    <w:lvlOverride w:ilvl="0"/>
-    <w:lvlOverride w:ilvl="1"/>
-    <w:lvlOverride w:ilvl="2"/>
-    <w:lvlOverride w:ilvl="3"/>
-    <w:lvlOverride w:ilvl="4"/>
-    <w:lvlOverride w:ilvl="5"/>
-    <w:lvlOverride w:ilvl="6"/>
-    <w:lvlOverride w:ilvl="7"/>
-    <w:lvlOverride w:ilvl="8"/>
+    <w:abstractNumId w:val="56"/>
+  </w:num>
+  <w:num w:numId="76">
+    <w:abstractNumId w:val="32"/>
+  </w:num>
+  <w:num w:numId="77">
+    <w:abstractNumId w:val="16"/>
+  </w:num>
+  <w:num w:numId="78">
+    <w:abstractNumId w:val="15"/>
+  </w:num>
+  <w:num w:numId="79">
+    <w:abstractNumId w:val="20"/>
   </w:num>
   <w:numIdMacAtCleanup w:val="72"/>
 </w:numbering>

</xml_diff>